<commit_message>
feat: bundle Hermes runtime and harden task workflows
</commit_message>
<xml_diff>
--- a/docs/neoworker-hermes-harness-open-plan.docx
+++ b/docs/neoworker-hermes-harness-open-plan.docx
@@ -8,7 +8,7 @@
       </w:pPr>
       <w:r>
         <w:rPr>
-          <w:rFonts w:ascii="STSong" w:hAnsi="STSong" w:eastAsia="STSong" w:cs="STSong" w:hint="eastAsia"/>
+          <w:rFonts w:ascii="FangSong" w:hAnsi="FangSong" w:eastAsia="FangSong" w:cs="FangSong" w:hint="eastAsia"/>
           <w:b/>
           <w:i w:val="0"/>
           <w:color w:val="202020"/>
@@ -25,7 +25,7 @@
       </w:pPr>
       <w:r>
         <w:rPr>
-          <w:rFonts w:ascii="STSong" w:hAnsi="STSong" w:eastAsia="STSong" w:cs="STSong" w:hint="eastAsia"/>
+          <w:rFonts w:ascii="FangSong" w:hAnsi="FangSong" w:eastAsia="FangSong" w:cs="FangSong" w:hint="eastAsia"/>
           <w:b w:val="0"/>
           <w:i w:val="0"/>
           <w:color w:val="202020"/>
@@ -79,7 +79,7 @@
             </w:pPr>
             <w:r>
               <w:rPr>
-                <w:rFonts w:ascii="STSong" w:hAnsi="STSong" w:eastAsia="STSong" w:cs="STSong" w:hint="eastAsia"/>
+                <w:rFonts w:ascii="FangSong" w:hAnsi="FangSong" w:eastAsia="FangSong" w:cs="FangSong" w:hint="eastAsia"/>
                 <w:b/>
                 <w:i w:val="0"/>
                 <w:color w:val="FFFFFF"/>
@@ -118,7 +118,7 @@
             </w:pPr>
             <w:r>
               <w:rPr>
-                <w:rFonts w:ascii="STSong" w:hAnsi="STSong" w:eastAsia="STSong" w:cs="STSong" w:hint="eastAsia"/>
+                <w:rFonts w:ascii="FangSong" w:hAnsi="FangSong" w:eastAsia="FangSong" w:cs="FangSong" w:hint="eastAsia"/>
                 <w:b/>
                 <w:i w:val="0"/>
                 <w:color w:val="FFFFFF"/>
@@ -159,7 +159,7 @@
             </w:pPr>
             <w:r>
               <w:rPr>
-                <w:rFonts w:ascii="STSong" w:hAnsi="STSong" w:eastAsia="STSong" w:cs="STSong" w:hint="eastAsia"/>
+                <w:rFonts w:ascii="FangSong" w:hAnsi="FangSong" w:eastAsia="FangSong" w:cs="FangSong" w:hint="eastAsia"/>
                 <w:b w:val="0"/>
                 <w:i w:val="0"/>
                 <w:color w:val="202020"/>
@@ -198,14 +198,14 @@
             </w:pPr>
             <w:r>
               <w:rPr>
-                <w:rFonts w:ascii="STSong" w:hAnsi="STSong" w:eastAsia="STSong" w:cs="STSong" w:hint="eastAsia"/>
+                <w:rFonts w:ascii="FangSong" w:hAnsi="FangSong" w:eastAsia="FangSong" w:cs="FangSong" w:hint="eastAsia"/>
                 <w:b w:val="0"/>
                 <w:i w:val="0"/>
                 <w:color w:val="202020"/>
                 <w:sz w:val="19"/>
                 <w:lang w:val="zh-CN" w:eastAsia="zh-CN" w:bidi="ar-SA"/>
               </w:rPr>
-              <w:t>开放草案，可根据评测和产品反馈调整</w:t>
+              <w:t>实施收口版，可根据后续评测和产品反馈调整</w:t>
             </w:r>
           </w:p>
         </w:tc>
@@ -239,7 +239,7 @@
             </w:pPr>
             <w:r>
               <w:rPr>
-                <w:rFonts w:ascii="STSong" w:hAnsi="STSong" w:eastAsia="STSong" w:cs="STSong" w:hint="eastAsia"/>
+                <w:rFonts w:ascii="FangSong" w:hAnsi="FangSong" w:eastAsia="FangSong" w:cs="FangSong" w:hint="eastAsia"/>
                 <w:b w:val="0"/>
                 <w:i w:val="0"/>
                 <w:color w:val="202020"/>
@@ -278,7 +278,7 @@
             </w:pPr>
             <w:r>
               <w:rPr>
-                <w:rFonts w:ascii="STSong" w:hAnsi="STSong" w:eastAsia="STSong" w:cs="STSong" w:hint="eastAsia"/>
+                <w:rFonts w:ascii="FangSong" w:hAnsi="FangSong" w:eastAsia="FangSong" w:cs="FangSong" w:hint="eastAsia"/>
                 <w:b w:val="0"/>
                 <w:i w:val="0"/>
                 <w:color w:val="202020"/>
@@ -319,7 +319,7 @@
             </w:pPr>
             <w:r>
               <w:rPr>
-                <w:rFonts w:ascii="STSong" w:hAnsi="STSong" w:eastAsia="STSong" w:cs="STSong" w:hint="eastAsia"/>
+                <w:rFonts w:ascii="FangSong" w:hAnsi="FangSong" w:eastAsia="FangSong" w:cs="FangSong" w:hint="eastAsia"/>
                 <w:b w:val="0"/>
                 <w:i w:val="0"/>
                 <w:color w:val="202020"/>
@@ -358,7 +358,7 @@
             </w:pPr>
             <w:r>
               <w:rPr>
-                <w:rFonts w:ascii="STSong" w:hAnsi="STSong" w:eastAsia="STSong" w:cs="STSong" w:hint="eastAsia"/>
+                <w:rFonts w:ascii="FangSong" w:hAnsi="FangSong" w:eastAsia="FangSong" w:cs="FangSong" w:hint="eastAsia"/>
                 <w:b w:val="0"/>
                 <w:i w:val="0"/>
                 <w:color w:val="202020"/>
@@ -399,7 +399,7 @@
             </w:pPr>
             <w:r>
               <w:rPr>
-                <w:rFonts w:ascii="STSong" w:hAnsi="STSong" w:eastAsia="STSong" w:cs="STSong" w:hint="eastAsia"/>
+                <w:rFonts w:ascii="FangSong" w:hAnsi="FangSong" w:eastAsia="FangSong" w:cs="FangSong" w:hint="eastAsia"/>
                 <w:b w:val="0"/>
                 <w:i w:val="0"/>
                 <w:color w:val="202020"/>
@@ -438,14 +438,14 @@
             </w:pPr>
             <w:r>
               <w:rPr>
-                <w:rFonts w:ascii="STSong" w:hAnsi="STSong" w:eastAsia="STSong" w:cs="STSong" w:hint="eastAsia"/>
+                <w:rFonts w:ascii="FangSong" w:hAnsi="FangSong" w:eastAsia="FangSong" w:cs="FangSong" w:hint="eastAsia"/>
                 <w:b w:val="0"/>
                 <w:i w:val="0"/>
                 <w:color w:val="202020"/>
                 <w:sz w:val="19"/>
                 <w:lang w:val="zh-CN" w:eastAsia="zh-CN" w:bidi="ar-SA"/>
               </w:rPr>
-              <w:t>优先采用 Hermes ACP Harness；由 NeoWorker 保留工具、副作用和任务治理权</w:t>
+              <w:t>新任务统一使用内置 Hermes ACP Harness；由 NeoWorker 保留工具、副作用和任务治理权</w:t>
             </w:r>
           </w:p>
         </w:tc>
@@ -464,7 +464,7 @@
       </w:pPr>
       <w:r>
         <w:rPr>
-          <w:rFonts w:ascii="STSong" w:hAnsi="STSong" w:eastAsia="STSong" w:cs="STSong" w:hint="eastAsia"/>
+          <w:rFonts w:ascii="FangSong" w:hAnsi="FangSong" w:eastAsia="FangSong" w:cs="FangSong" w:hint="eastAsia"/>
           <w:b/>
           <w:i w:val="0"/>
           <w:color w:val="202020"/>
@@ -482,14 +482,14 @@
       </w:pPr>
       <w:r>
         <w:rPr>
-          <w:rFonts w:ascii="STSong" w:hAnsi="STSong" w:eastAsia="STSong" w:cs="STSong" w:hint="eastAsia"/>
+          <w:rFonts w:ascii="FangSong" w:hAnsi="FangSong" w:eastAsia="FangSong" w:cs="FangSong" w:hint="eastAsia"/>
           <w:b w:val="0"/>
           <w:i w:val="0"/>
           <w:color w:val="202020"/>
           <w:sz w:val="21"/>
           <w:lang w:val="zh-CN" w:eastAsia="zh-CN" w:bidi="ar-SA"/>
         </w:rPr>
-        <w:t>建议把 Hermes ACP Harness 逐步作为 NeoWorker 处理复杂 Agent 任务的首选执行引擎，同时保留 NeoWorker 原生 Runtime 作为快速路径。Hermes 负责 Agent Loop、规划和多步推进，NeoWorker 负责工具筛选、权限审批、沙箱、任务状态、证据记录和最终交付。这个组合既能吸收 Hermes 的执行能力，也能保留 NeoWorker 对本地副作用的控制。</w:t>
+        <w:t>NeoWorker 的新任务统一使用内置 Hermes ACP Harness。Hermes 负责 Agent Loop、规划和多步推进，NeoWorker 负责工具筛选、权限审批、沙箱、任务状态、证据记录和最终交付。Native SessionRuntime 仅作为历史任务兼容路径和明确的内部保底能力保留，不再作为新任务的按复杂度分流目标。</w:t>
       </w:r>
     </w:p>
     <w:p>
@@ -500,14 +500,14 @@
       </w:pPr>
       <w:r>
         <w:rPr>
-          <w:rFonts w:ascii="STSong" w:hAnsi="STSong" w:eastAsia="STSong" w:cs="STSong" w:hint="eastAsia"/>
+          <w:rFonts w:ascii="FangSong" w:hAnsi="FangSong" w:eastAsia="FangSong" w:cs="FangSong" w:hint="eastAsia"/>
           <w:b w:val="0"/>
           <w:i w:val="0"/>
           <w:color w:val="202020"/>
           <w:sz w:val="21"/>
           <w:lang w:val="zh-CN" w:eastAsia="zh-CN" w:bidi="ar-SA"/>
         </w:rPr>
-        <w:t>这是一项可行的增量改造，不需要重写 NeoWorker 的工具体系。当前代码已经具备 Hermes ACP 适配、任务级 MCP Tool Host、权限桥接、checkpoint、暂停恢复和宿主工具多步验收能力。尚未完成的部分主要是产品路由、运行时可见性、能力覆盖评测，以及把当前的“显式 opt-in”推进成可控的 Auto 模式。</w:t>
+        <w:t>这项改造已经落到 NeoWorker 的任务创建、IPC、运行时路由和执行器：新任务会绑定内置 Hermes ACP Host，前端不再暴露 Auto、Hermes、Native 运行时选择，Hermes 启动失败也不会静默切换到 Native。后续重点是持续扩大能力覆盖、完善真实任务评测和发布门禁，而不是再做一套面向用户的运行时选择器。</w:t>
       </w:r>
     </w:p>
     <w:p>
@@ -518,7 +518,7 @@
       </w:pPr>
       <w:r>
         <w:rPr>
-          <w:rFonts w:ascii="STSong" w:hAnsi="STSong" w:eastAsia="STSong" w:cs="STSong" w:hint="eastAsia"/>
+          <w:rFonts w:ascii="FangSong" w:hAnsi="FangSong" w:eastAsia="FangSong" w:cs="FangSong" w:hint="eastAsia"/>
           <w:b/>
           <w:i w:val="0"/>
           <w:color w:val="202020"/>
@@ -529,7 +529,7 @@
       </w:r>
       <w:r>
         <w:rPr>
-          <w:rFonts w:ascii="STSong" w:hAnsi="STSong" w:eastAsia="STSong" w:cs="STSong" w:hint="eastAsia"/>
+          <w:rFonts w:ascii="FangSong" w:hAnsi="FangSong" w:eastAsia="FangSong" w:cs="FangSong" w:hint="eastAsia"/>
           <w:b w:val="0"/>
           <w:i w:val="0"/>
           <w:color w:val="202020"/>
@@ -547,7 +547,7 @@
       </w:pPr>
       <w:r>
         <w:rPr>
-          <w:rFonts w:ascii="STSong" w:hAnsi="STSong" w:eastAsia="STSong" w:cs="STSong" w:hint="eastAsia"/>
+          <w:rFonts w:ascii="FangSong" w:hAnsi="FangSong" w:eastAsia="FangSong" w:cs="FangSong" w:hint="eastAsia"/>
           <w:b/>
           <w:i w:val="0"/>
           <w:color w:val="202020"/>
@@ -565,14 +565,14 @@
       </w:pPr>
       <w:r>
         <w:rPr>
-          <w:rFonts w:ascii="STSong" w:hAnsi="STSong" w:eastAsia="STSong" w:cs="STSong" w:hint="eastAsia"/>
+          <w:rFonts w:ascii="FangSong" w:hAnsi="FangSong" w:eastAsia="FangSong" w:cs="FangSong" w:hint="eastAsia"/>
           <w:b w:val="0"/>
           <w:i w:val="0"/>
           <w:color w:val="202020"/>
           <w:sz w:val="21"/>
           <w:lang w:val="zh-CN" w:eastAsia="zh-CN" w:bidi="ar-SA"/>
         </w:rPr>
-        <w:t>NeoWorker 目前存在三种 Hermes 相关接入方式。它们的执行语义不同，不能只看 Provider 名称或 OpenAI-compatible 接口来判断是否真正使用了 Hermes Harness。</w:t>
+        <w:t>NeoWorker 需要区分“内置 Hermes Harness”和历史或显式外部 Runtime。它们的执行语义不同，不能只看 Provider 名称或 OpenAI-compatible 接口来判断是否真正使用了 Hermes Harness。</w:t>
       </w:r>
     </w:p>
     <w:tbl>
@@ -621,7 +621,7 @@
             </w:pPr>
             <w:r>
               <w:rPr>
-                <w:rFonts w:ascii="STSong" w:hAnsi="STSong" w:eastAsia="STSong" w:cs="STSong" w:hint="eastAsia"/>
+                <w:rFonts w:ascii="FangSong" w:hAnsi="FangSong" w:eastAsia="FangSong" w:cs="FangSong" w:hint="eastAsia"/>
                 <w:b/>
                 <w:i w:val="0"/>
                 <w:color w:val="FFFFFF"/>
@@ -660,7 +660,7 @@
             </w:pPr>
             <w:r>
               <w:rPr>
-                <w:rFonts w:ascii="STSong" w:hAnsi="STSong" w:eastAsia="STSong" w:cs="STSong" w:hint="eastAsia"/>
+                <w:rFonts w:ascii="FangSong" w:hAnsi="FangSong" w:eastAsia="FangSong" w:cs="FangSong" w:hint="eastAsia"/>
                 <w:b/>
                 <w:i w:val="0"/>
                 <w:color w:val="FFFFFF"/>
@@ -699,7 +699,7 @@
             </w:pPr>
             <w:r>
               <w:rPr>
-                <w:rFonts w:ascii="STSong" w:hAnsi="STSong" w:eastAsia="STSong" w:cs="STSong" w:hint="eastAsia"/>
+                <w:rFonts w:ascii="FangSong" w:hAnsi="FangSong" w:eastAsia="FangSong" w:cs="FangSong" w:hint="eastAsia"/>
                 <w:b/>
                 <w:i w:val="0"/>
                 <w:color w:val="FFFFFF"/>
@@ -738,7 +738,7 @@
             </w:pPr>
             <w:r>
               <w:rPr>
-                <w:rFonts w:ascii="STSong" w:hAnsi="STSong" w:eastAsia="STSong" w:cs="STSong" w:hint="eastAsia"/>
+                <w:rFonts w:ascii="FangSong" w:hAnsi="FangSong" w:eastAsia="FangSong" w:cs="FangSong" w:hint="eastAsia"/>
                 <w:b/>
                 <w:i w:val="0"/>
                 <w:color w:val="FFFFFF"/>
@@ -779,14 +779,14 @@
             </w:pPr>
             <w:r>
               <w:rPr>
-                <w:rFonts w:ascii="STSong" w:hAnsi="STSong" w:eastAsia="STSong" w:cs="STSong" w:hint="eastAsia"/>
+                <w:rFonts w:ascii="FangSong" w:hAnsi="FangSong" w:eastAsia="FangSong" w:cs="FangSong" w:hint="eastAsia"/>
                 <w:b w:val="0"/>
                 <w:i w:val="0"/>
                 <w:color w:val="202020"/>
                 <w:sz w:val="18"/>
                 <w:lang w:val="zh-CN" w:eastAsia="zh-CN" w:bidi="ar-SA"/>
               </w:rPr>
-              <w:t>Hermes Agent 8642</w:t>
+              <w:t>NeoWorker 内置 Hermes ACP Host</w:t>
             </w:r>
           </w:p>
         </w:tc>
@@ -818,7 +818,7 @@
             </w:pPr>
             <w:r>
               <w:rPr>
-                <w:rFonts w:ascii="STSong" w:hAnsi="STSong" w:eastAsia="STSong" w:cs="STSong" w:hint="eastAsia"/>
+                <w:rFonts w:ascii="FangSong" w:hAnsi="FangSong" w:eastAsia="FangSong" w:cs="FangSong" w:hint="eastAsia"/>
                 <w:b w:val="0"/>
                 <w:i w:val="0"/>
                 <w:color w:val="202020"/>
@@ -857,327 +857,7 @@
             </w:pPr>
             <w:r>
               <w:rPr>
-                <w:rFonts w:ascii="STSong" w:hAnsi="STSong" w:eastAsia="STSong" w:cs="STSong" w:hint="eastAsia"/>
-                <w:b w:val="0"/>
-                <w:i w:val="0"/>
-                <w:color w:val="202020"/>
-                <w:sz w:val="18"/>
-                <w:lang w:val="zh-CN" w:eastAsia="zh-CN" w:bidi="ar-SA"/>
-              </w:rPr>
-              <w:t>Hermes</w:t>
-            </w:r>
-          </w:p>
-        </w:tc>
-        <w:tc>
-          <w:tcPr>
-            <w:tcW w:type="dxa" w:w="3585"/>
-            <w:tcBorders>
-              <w:top w:val="single" w:sz="6" w:space="0" w:color="D9D9D9"/>
-              <w:left w:val="single" w:sz="6" w:space="0" w:color="D9D9D9"/>
-              <w:bottom w:val="single" w:sz="6" w:space="0" w:color="D9D9D9"/>
-              <w:right w:val="single" w:sz="6" w:space="0" w:color="D9D9D9"/>
-              <w:insideH w:val="single" w:sz="6" w:space="0" w:color="D9D9D9"/>
-              <w:insideV w:val="single" w:sz="6" w:space="0" w:color="D9D9D9"/>
-            </w:tcBorders>
-            <w:tcMar>
-              <w:top w:w="105" w:type="dxa"/>
-              <w:start w:w="130" w:type="dxa"/>
-              <w:bottom w:w="105" w:type="dxa"/>
-              <w:end w:w="130" w:type="dxa"/>
-            </w:tcMar>
-            <w:vAlign w:val="center"/>
-          </w:tcPr>
-          <w:p>
-            <w:pPr>
-              <w:keepLines/>
-              <w:spacing w:before="0" w:after="0" w:line="259" w:lineRule="auto"/>
-              <w:ind w:left="0" w:firstLine="0"/>
-              <w:jc w:val="left"/>
-            </w:pPr>
-            <w:r>
-              <w:rPr>
-                <w:rFonts w:ascii="STSong" w:hAnsi="STSong" w:eastAsia="STSong" w:cs="STSong" w:hint="eastAsia"/>
-                <w:b w:val="0"/>
-                <w:i w:val="0"/>
-                <w:color w:val="202020"/>
-                <w:sz w:val="18"/>
-                <w:lang w:val="zh-CN" w:eastAsia="zh-CN" w:bidi="ar-SA"/>
-              </w:rPr>
-              <w:t>完整 Hermes 外部 Runtime，NeoWorker 不拥有副作用</w:t>
-            </w:r>
-          </w:p>
-        </w:tc>
-      </w:tr>
-      <w:tr>
-        <w:tc>
-          <w:tcPr>
-            <w:tcW w:type="dxa" w:w="2232"/>
-            <w:tcBorders>
-              <w:top w:val="single" w:sz="6" w:space="0" w:color="D9D9D9"/>
-              <w:left w:val="single" w:sz="6" w:space="0" w:color="D9D9D9"/>
-              <w:bottom w:val="single" w:sz="6" w:space="0" w:color="D9D9D9"/>
-              <w:right w:val="single" w:sz="6" w:space="0" w:color="D9D9D9"/>
-              <w:insideH w:val="single" w:sz="6" w:space="0" w:color="D9D9D9"/>
-              <w:insideV w:val="single" w:sz="6" w:space="0" w:color="D9D9D9"/>
-            </w:tcBorders>
-            <w:shd w:val="clear" w:fill="EAF1F7"/>
-            <w:tcMar>
-              <w:top w:w="105" w:type="dxa"/>
-              <w:start w:w="130" w:type="dxa"/>
-              <w:bottom w:w="105" w:type="dxa"/>
-              <w:end w:w="130" w:type="dxa"/>
-            </w:tcMar>
-            <w:vAlign w:val="center"/>
-          </w:tcPr>
-          <w:p>
-            <w:pPr>
-              <w:keepLines/>
-              <w:spacing w:before="0" w:after="0" w:line="259" w:lineRule="auto"/>
-              <w:ind w:left="0" w:firstLine="0"/>
-              <w:jc w:val="left"/>
-            </w:pPr>
-            <w:r>
-              <w:rPr>
-                <w:rFonts w:ascii="STSong" w:hAnsi="STSong" w:eastAsia="STSong" w:cs="STSong" w:hint="eastAsia"/>
-                <w:b w:val="0"/>
-                <w:i w:val="0"/>
-                <w:color w:val="202020"/>
-                <w:sz w:val="18"/>
-                <w:lang w:val="zh-CN" w:eastAsia="zh-CN" w:bidi="ar-SA"/>
-              </w:rPr>
-              <w:t>Hermes Model Proxy 8645</w:t>
-            </w:r>
-          </w:p>
-        </w:tc>
-        <w:tc>
-          <w:tcPr>
-            <w:tcW w:type="dxa" w:w="1800"/>
-            <w:tcBorders>
-              <w:top w:val="single" w:sz="6" w:space="0" w:color="D9D9D9"/>
-              <w:left w:val="single" w:sz="6" w:space="0" w:color="D9D9D9"/>
-              <w:bottom w:val="single" w:sz="6" w:space="0" w:color="D9D9D9"/>
-              <w:right w:val="single" w:sz="6" w:space="0" w:color="D9D9D9"/>
-              <w:insideH w:val="single" w:sz="6" w:space="0" w:color="D9D9D9"/>
-              <w:insideV w:val="single" w:sz="6" w:space="0" w:color="D9D9D9"/>
-            </w:tcBorders>
-            <w:shd w:val="clear" w:fill="EAF1F7"/>
-            <w:tcMar>
-              <w:top w:w="105" w:type="dxa"/>
-              <w:start w:w="130" w:type="dxa"/>
-              <w:bottom w:w="105" w:type="dxa"/>
-              <w:end w:w="130" w:type="dxa"/>
-            </w:tcMar>
-            <w:vAlign w:val="center"/>
-          </w:tcPr>
-          <w:p>
-            <w:pPr>
-              <w:keepLines/>
-              <w:spacing w:before="0" w:after="0" w:line="259" w:lineRule="auto"/>
-              <w:ind w:left="0" w:firstLine="0"/>
-              <w:jc w:val="left"/>
-            </w:pPr>
-            <w:r>
-              <w:rPr>
-                <w:rFonts w:ascii="STSong" w:hAnsi="STSong" w:eastAsia="STSong" w:cs="STSong" w:hint="eastAsia"/>
-                <w:b w:val="0"/>
-                <w:i w:val="0"/>
-                <w:color w:val="202020"/>
-                <w:sz w:val="18"/>
-                <w:lang w:val="zh-CN" w:eastAsia="zh-CN" w:bidi="ar-SA"/>
-              </w:rPr>
-              <w:t>NeoWorker</w:t>
-            </w:r>
-          </w:p>
-        </w:tc>
-        <w:tc>
-          <w:tcPr>
-            <w:tcW w:type="dxa" w:w="2232"/>
-            <w:tcBorders>
-              <w:top w:val="single" w:sz="6" w:space="0" w:color="D9D9D9"/>
-              <w:left w:val="single" w:sz="6" w:space="0" w:color="D9D9D9"/>
-              <w:bottom w:val="single" w:sz="6" w:space="0" w:color="D9D9D9"/>
-              <w:right w:val="single" w:sz="6" w:space="0" w:color="D9D9D9"/>
-              <w:insideH w:val="single" w:sz="6" w:space="0" w:color="D9D9D9"/>
-              <w:insideV w:val="single" w:sz="6" w:space="0" w:color="D9D9D9"/>
-            </w:tcBorders>
-            <w:shd w:val="clear" w:fill="EAF1F7"/>
-            <w:tcMar>
-              <w:top w:w="105" w:type="dxa"/>
-              <w:start w:w="130" w:type="dxa"/>
-              <w:bottom w:w="105" w:type="dxa"/>
-              <w:end w:w="130" w:type="dxa"/>
-            </w:tcMar>
-            <w:vAlign w:val="center"/>
-          </w:tcPr>
-          <w:p>
-            <w:pPr>
-              <w:keepLines/>
-              <w:spacing w:before="0" w:after="0" w:line="259" w:lineRule="auto"/>
-              <w:ind w:left="0" w:firstLine="0"/>
-              <w:jc w:val="left"/>
-            </w:pPr>
-            <w:r>
-              <w:rPr>
-                <w:rFonts w:ascii="STSong" w:hAnsi="STSong" w:eastAsia="STSong" w:cs="STSong" w:hint="eastAsia"/>
-                <w:b w:val="0"/>
-                <w:i w:val="0"/>
-                <w:color w:val="202020"/>
-                <w:sz w:val="18"/>
-                <w:lang w:val="zh-CN" w:eastAsia="zh-CN" w:bidi="ar-SA"/>
-              </w:rPr>
-              <w:t>NeoWorker</w:t>
-            </w:r>
-          </w:p>
-        </w:tc>
-        <w:tc>
-          <w:tcPr>
-            <w:tcW w:type="dxa" w:w="3585"/>
-            <w:tcBorders>
-              <w:top w:val="single" w:sz="6" w:space="0" w:color="D9D9D9"/>
-              <w:left w:val="single" w:sz="6" w:space="0" w:color="D9D9D9"/>
-              <w:bottom w:val="single" w:sz="6" w:space="0" w:color="D9D9D9"/>
-              <w:right w:val="single" w:sz="6" w:space="0" w:color="D9D9D9"/>
-              <w:insideH w:val="single" w:sz="6" w:space="0" w:color="D9D9D9"/>
-              <w:insideV w:val="single" w:sz="6" w:space="0" w:color="D9D9D9"/>
-            </w:tcBorders>
-            <w:shd w:val="clear" w:fill="EAF1F7"/>
-            <w:tcMar>
-              <w:top w:w="105" w:type="dxa"/>
-              <w:start w:w="130" w:type="dxa"/>
-              <w:bottom w:w="105" w:type="dxa"/>
-              <w:end w:w="130" w:type="dxa"/>
-            </w:tcMar>
-            <w:vAlign w:val="center"/>
-          </w:tcPr>
-          <w:p>
-            <w:pPr>
-              <w:keepLines/>
-              <w:spacing w:before="0" w:after="0" w:line="259" w:lineRule="auto"/>
-              <w:ind w:left="0" w:firstLine="0"/>
-              <w:jc w:val="left"/>
-            </w:pPr>
-            <w:r>
-              <w:rPr>
-                <w:rFonts w:ascii="STSong" w:hAnsi="STSong" w:eastAsia="STSong" w:cs="STSong" w:hint="eastAsia"/>
-                <w:b w:val="0"/>
-                <w:i w:val="0"/>
-                <w:color w:val="202020"/>
-                <w:sz w:val="18"/>
-                <w:lang w:val="zh-CN" w:eastAsia="zh-CN" w:bidi="ar-SA"/>
-              </w:rPr>
-              <w:t>模型凭据转发，不等于 Hermes Harness</w:t>
-            </w:r>
-          </w:p>
-        </w:tc>
-      </w:tr>
-      <w:tr>
-        <w:tc>
-          <w:tcPr>
-            <w:tcW w:type="dxa" w:w="2232"/>
-            <w:tcBorders>
-              <w:top w:val="single" w:sz="6" w:space="0" w:color="D9D9D9"/>
-              <w:left w:val="single" w:sz="6" w:space="0" w:color="D9D9D9"/>
-              <w:bottom w:val="single" w:sz="6" w:space="0" w:color="D9D9D9"/>
-              <w:right w:val="single" w:sz="6" w:space="0" w:color="D9D9D9"/>
-              <w:insideH w:val="single" w:sz="6" w:space="0" w:color="D9D9D9"/>
-              <w:insideV w:val="single" w:sz="6" w:space="0" w:color="D9D9D9"/>
-            </w:tcBorders>
-            <w:tcMar>
-              <w:top w:w="105" w:type="dxa"/>
-              <w:start w:w="130" w:type="dxa"/>
-              <w:bottom w:w="105" w:type="dxa"/>
-              <w:end w:w="130" w:type="dxa"/>
-            </w:tcMar>
-            <w:vAlign w:val="center"/>
-          </w:tcPr>
-          <w:p>
-            <w:pPr>
-              <w:keepLines/>
-              <w:spacing w:before="0" w:after="0" w:line="259" w:lineRule="auto"/>
-              <w:ind w:left="0" w:firstLine="0"/>
-              <w:jc w:val="left"/>
-            </w:pPr>
-            <w:r>
-              <w:rPr>
-                <w:rFonts w:ascii="STSong" w:hAnsi="STSong" w:eastAsia="STSong" w:cs="STSong" w:hint="eastAsia"/>
-                <w:b w:val="0"/>
-                <w:i w:val="0"/>
-                <w:color w:val="202020"/>
-                <w:sz w:val="18"/>
-                <w:lang w:val="zh-CN" w:eastAsia="zh-CN" w:bidi="ar-SA"/>
-              </w:rPr>
-              <w:t>Hermes ACP 适配器</w:t>
-            </w:r>
-          </w:p>
-        </w:tc>
-        <w:tc>
-          <w:tcPr>
-            <w:tcW w:type="dxa" w:w="1800"/>
-            <w:tcBorders>
-              <w:top w:val="single" w:sz="6" w:space="0" w:color="D9D9D9"/>
-              <w:left w:val="single" w:sz="6" w:space="0" w:color="D9D9D9"/>
-              <w:bottom w:val="single" w:sz="6" w:space="0" w:color="D9D9D9"/>
-              <w:right w:val="single" w:sz="6" w:space="0" w:color="D9D9D9"/>
-              <w:insideH w:val="single" w:sz="6" w:space="0" w:color="D9D9D9"/>
-              <w:insideV w:val="single" w:sz="6" w:space="0" w:color="D9D9D9"/>
-            </w:tcBorders>
-            <w:tcMar>
-              <w:top w:w="105" w:type="dxa"/>
-              <w:start w:w="130" w:type="dxa"/>
-              <w:bottom w:w="105" w:type="dxa"/>
-              <w:end w:w="130" w:type="dxa"/>
-            </w:tcMar>
-            <w:vAlign w:val="center"/>
-          </w:tcPr>
-          <w:p>
-            <w:pPr>
-              <w:keepLines/>
-              <w:spacing w:before="0" w:after="0" w:line="259" w:lineRule="auto"/>
-              <w:ind w:left="0" w:firstLine="0"/>
-              <w:jc w:val="left"/>
-            </w:pPr>
-            <w:r>
-              <w:rPr>
-                <w:rFonts w:ascii="STSong" w:hAnsi="STSong" w:eastAsia="STSong" w:cs="STSong" w:hint="eastAsia"/>
-                <w:b w:val="0"/>
-                <w:i w:val="0"/>
-                <w:color w:val="202020"/>
-                <w:sz w:val="18"/>
-                <w:lang w:val="zh-CN" w:eastAsia="zh-CN" w:bidi="ar-SA"/>
-              </w:rPr>
-              <w:t>Hermes</w:t>
-            </w:r>
-          </w:p>
-        </w:tc>
-        <w:tc>
-          <w:tcPr>
-            <w:tcW w:type="dxa" w:w="2232"/>
-            <w:tcBorders>
-              <w:top w:val="single" w:sz="6" w:space="0" w:color="D9D9D9"/>
-              <w:left w:val="single" w:sz="6" w:space="0" w:color="D9D9D9"/>
-              <w:bottom w:val="single" w:sz="6" w:space="0" w:color="D9D9D9"/>
-              <w:right w:val="single" w:sz="6" w:space="0" w:color="D9D9D9"/>
-              <w:insideH w:val="single" w:sz="6" w:space="0" w:color="D9D9D9"/>
-              <w:insideV w:val="single" w:sz="6" w:space="0" w:color="D9D9D9"/>
-            </w:tcBorders>
-            <w:tcMar>
-              <w:top w:w="105" w:type="dxa"/>
-              <w:start w:w="130" w:type="dxa"/>
-              <w:bottom w:w="105" w:type="dxa"/>
-              <w:end w:w="130" w:type="dxa"/>
-            </w:tcMar>
-            <w:vAlign w:val="center"/>
-          </w:tcPr>
-          <w:p>
-            <w:pPr>
-              <w:keepLines/>
-              <w:spacing w:before="0" w:after="0" w:line="259" w:lineRule="auto"/>
-              <w:ind w:left="0" w:firstLine="0"/>
-              <w:jc w:val="left"/>
-            </w:pPr>
-            <w:r>
-              <w:rPr>
-                <w:rFonts w:ascii="STSong" w:hAnsi="STSong" w:eastAsia="STSong" w:cs="STSong" w:hint="eastAsia"/>
+                <w:rFonts w:ascii="FangSong" w:hAnsi="FangSong" w:eastAsia="FangSong" w:cs="FangSong" w:hint="eastAsia"/>
                 <w:b w:val="0"/>
                 <w:i w:val="0"/>
                 <w:color w:val="202020"/>
@@ -1216,14 +896,334 @@
             </w:pPr>
             <w:r>
               <w:rPr>
-                <w:rFonts w:ascii="STSong" w:hAnsi="STSong" w:eastAsia="STSong" w:cs="STSong" w:hint="eastAsia"/>
+                <w:rFonts w:ascii="FangSong" w:hAnsi="FangSong" w:eastAsia="FangSong" w:cs="FangSong" w:hint="eastAsia"/>
                 <w:b w:val="0"/>
                 <w:i w:val="0"/>
                 <w:color w:val="202020"/>
                 <w:sz w:val="18"/>
                 <w:lang w:val="zh-CN" w:eastAsia="zh-CN" w:bidi="ar-SA"/>
               </w:rPr>
-              <w:t>推荐的生产桥接路径</w:t>
+              <w:t>新任务默认路径，随安装包交付</w:t>
+            </w:r>
+          </w:p>
+        </w:tc>
+      </w:tr>
+      <w:tr>
+        <w:tc>
+          <w:tcPr>
+            <w:tcW w:type="dxa" w:w="2232"/>
+            <w:tcBorders>
+              <w:top w:val="single" w:sz="6" w:space="0" w:color="D9D9D9"/>
+              <w:left w:val="single" w:sz="6" w:space="0" w:color="D9D9D9"/>
+              <w:bottom w:val="single" w:sz="6" w:space="0" w:color="D9D9D9"/>
+              <w:right w:val="single" w:sz="6" w:space="0" w:color="D9D9D9"/>
+              <w:insideH w:val="single" w:sz="6" w:space="0" w:color="D9D9D9"/>
+              <w:insideV w:val="single" w:sz="6" w:space="0" w:color="D9D9D9"/>
+            </w:tcBorders>
+            <w:shd w:val="clear" w:fill="EAF1F7"/>
+            <w:tcMar>
+              <w:top w:w="105" w:type="dxa"/>
+              <w:start w:w="130" w:type="dxa"/>
+              <w:bottom w:w="105" w:type="dxa"/>
+              <w:end w:w="130" w:type="dxa"/>
+            </w:tcMar>
+            <w:vAlign w:val="center"/>
+          </w:tcPr>
+          <w:p>
+            <w:pPr>
+              <w:keepLines/>
+              <w:spacing w:before="0" w:after="0" w:line="259" w:lineRule="auto"/>
+              <w:ind w:left="0" w:firstLine="0"/>
+              <w:jc w:val="left"/>
+            </w:pPr>
+            <w:r>
+              <w:rPr>
+                <w:rFonts w:ascii="FangSong" w:hAnsi="FangSong" w:eastAsia="FangSong" w:cs="FangSong" w:hint="eastAsia"/>
+                <w:b w:val="0"/>
+                <w:i w:val="0"/>
+                <w:color w:val="202020"/>
+                <w:sz w:val="18"/>
+                <w:lang w:val="zh-CN" w:eastAsia="zh-CN" w:bidi="ar-SA"/>
+              </w:rPr>
+              <w:t>显式外部 ACP Runtime</w:t>
+            </w:r>
+          </w:p>
+        </w:tc>
+        <w:tc>
+          <w:tcPr>
+            <w:tcW w:type="dxa" w:w="1800"/>
+            <w:tcBorders>
+              <w:top w:val="single" w:sz="6" w:space="0" w:color="D9D9D9"/>
+              <w:left w:val="single" w:sz="6" w:space="0" w:color="D9D9D9"/>
+              <w:bottom w:val="single" w:sz="6" w:space="0" w:color="D9D9D9"/>
+              <w:right w:val="single" w:sz="6" w:space="0" w:color="D9D9D9"/>
+              <w:insideH w:val="single" w:sz="6" w:space="0" w:color="D9D9D9"/>
+              <w:insideV w:val="single" w:sz="6" w:space="0" w:color="D9D9D9"/>
+            </w:tcBorders>
+            <w:shd w:val="clear" w:fill="EAF1F7"/>
+            <w:tcMar>
+              <w:top w:w="105" w:type="dxa"/>
+              <w:start w:w="130" w:type="dxa"/>
+              <w:bottom w:w="105" w:type="dxa"/>
+              <w:end w:w="130" w:type="dxa"/>
+            </w:tcMar>
+            <w:vAlign w:val="center"/>
+          </w:tcPr>
+          <w:p>
+            <w:pPr>
+              <w:keepLines/>
+              <w:spacing w:before="0" w:after="0" w:line="259" w:lineRule="auto"/>
+              <w:ind w:left="0" w:firstLine="0"/>
+              <w:jc w:val="left"/>
+            </w:pPr>
+            <w:r>
+              <w:rPr>
+                <w:rFonts w:ascii="FangSong" w:hAnsi="FangSong" w:eastAsia="FangSong" w:cs="FangSong" w:hint="eastAsia"/>
+                <w:b w:val="0"/>
+                <w:i w:val="0"/>
+                <w:color w:val="202020"/>
+                <w:sz w:val="18"/>
+                <w:lang w:val="zh-CN" w:eastAsia="zh-CN" w:bidi="ar-SA"/>
+              </w:rPr>
+              <w:t>外部 Agent</w:t>
+            </w:r>
+          </w:p>
+        </w:tc>
+        <w:tc>
+          <w:tcPr>
+            <w:tcW w:type="dxa" w:w="2232"/>
+            <w:tcBorders>
+              <w:top w:val="single" w:sz="6" w:space="0" w:color="D9D9D9"/>
+              <w:left w:val="single" w:sz="6" w:space="0" w:color="D9D9D9"/>
+              <w:bottom w:val="single" w:sz="6" w:space="0" w:color="D9D9D9"/>
+              <w:right w:val="single" w:sz="6" w:space="0" w:color="D9D9D9"/>
+              <w:insideH w:val="single" w:sz="6" w:space="0" w:color="D9D9D9"/>
+              <w:insideV w:val="single" w:sz="6" w:space="0" w:color="D9D9D9"/>
+            </w:tcBorders>
+            <w:shd w:val="clear" w:fill="EAF1F7"/>
+            <w:tcMar>
+              <w:top w:w="105" w:type="dxa"/>
+              <w:start w:w="130" w:type="dxa"/>
+              <w:bottom w:w="105" w:type="dxa"/>
+              <w:end w:w="130" w:type="dxa"/>
+            </w:tcMar>
+            <w:vAlign w:val="center"/>
+          </w:tcPr>
+          <w:p>
+            <w:pPr>
+              <w:keepLines/>
+              <w:spacing w:before="0" w:after="0" w:line="259" w:lineRule="auto"/>
+              <w:ind w:left="0" w:firstLine="0"/>
+              <w:jc w:val="left"/>
+            </w:pPr>
+            <w:r>
+              <w:rPr>
+                <w:rFonts w:ascii="FangSong" w:hAnsi="FangSong" w:eastAsia="FangSong" w:cs="FangSong" w:hint="eastAsia"/>
+                <w:b w:val="0"/>
+                <w:i w:val="0"/>
+                <w:color w:val="202020"/>
+                <w:sz w:val="18"/>
+                <w:lang w:val="zh-CN" w:eastAsia="zh-CN" w:bidi="ar-SA"/>
+              </w:rPr>
+              <w:t>外部 Runtime 或 NeoWorker Host</w:t>
+            </w:r>
+          </w:p>
+        </w:tc>
+        <w:tc>
+          <w:tcPr>
+            <w:tcW w:type="dxa" w:w="3585"/>
+            <w:tcBorders>
+              <w:top w:val="single" w:sz="6" w:space="0" w:color="D9D9D9"/>
+              <w:left w:val="single" w:sz="6" w:space="0" w:color="D9D9D9"/>
+              <w:bottom w:val="single" w:sz="6" w:space="0" w:color="D9D9D9"/>
+              <w:right w:val="single" w:sz="6" w:space="0" w:color="D9D9D9"/>
+              <w:insideH w:val="single" w:sz="6" w:space="0" w:color="D9D9D9"/>
+              <w:insideV w:val="single" w:sz="6" w:space="0" w:color="D9D9D9"/>
+            </w:tcBorders>
+            <w:shd w:val="clear" w:fill="EAF1F7"/>
+            <w:tcMar>
+              <w:top w:w="105" w:type="dxa"/>
+              <w:start w:w="130" w:type="dxa"/>
+              <w:bottom w:w="105" w:type="dxa"/>
+              <w:end w:w="130" w:type="dxa"/>
+            </w:tcMar>
+            <w:vAlign w:val="center"/>
+          </w:tcPr>
+          <w:p>
+            <w:pPr>
+              <w:keepLines/>
+              <w:spacing w:before="0" w:after="0" w:line="259" w:lineRule="auto"/>
+              <w:ind w:left="0" w:firstLine="0"/>
+              <w:jc w:val="left"/>
+            </w:pPr>
+            <w:r>
+              <w:rPr>
+                <w:rFonts w:ascii="FangSong" w:hAnsi="FangSong" w:eastAsia="FangSong" w:cs="FangSong" w:hint="eastAsia"/>
+                <w:b w:val="0"/>
+                <w:i w:val="0"/>
+                <w:color w:val="202020"/>
+                <w:sz w:val="18"/>
+                <w:lang w:val="zh-CN" w:eastAsia="zh-CN" w:bidi="ar-SA"/>
+              </w:rPr>
+              <w:t>仅兼容旧任务和内部集成</w:t>
+            </w:r>
+          </w:p>
+        </w:tc>
+      </w:tr>
+      <w:tr>
+        <w:tc>
+          <w:tcPr>
+            <w:tcW w:type="dxa" w:w="2232"/>
+            <w:tcBorders>
+              <w:top w:val="single" w:sz="6" w:space="0" w:color="D9D9D9"/>
+              <w:left w:val="single" w:sz="6" w:space="0" w:color="D9D9D9"/>
+              <w:bottom w:val="single" w:sz="6" w:space="0" w:color="D9D9D9"/>
+              <w:right w:val="single" w:sz="6" w:space="0" w:color="D9D9D9"/>
+              <w:insideH w:val="single" w:sz="6" w:space="0" w:color="D9D9D9"/>
+              <w:insideV w:val="single" w:sz="6" w:space="0" w:color="D9D9D9"/>
+            </w:tcBorders>
+            <w:tcMar>
+              <w:top w:w="105" w:type="dxa"/>
+              <w:start w:w="130" w:type="dxa"/>
+              <w:bottom w:w="105" w:type="dxa"/>
+              <w:end w:w="130" w:type="dxa"/>
+            </w:tcMar>
+            <w:vAlign w:val="center"/>
+          </w:tcPr>
+          <w:p>
+            <w:pPr>
+              <w:keepLines/>
+              <w:spacing w:before="0" w:after="0" w:line="259" w:lineRule="auto"/>
+              <w:ind w:left="0" w:firstLine="0"/>
+              <w:jc w:val="left"/>
+            </w:pPr>
+            <w:r>
+              <w:rPr>
+                <w:rFonts w:ascii="FangSong" w:hAnsi="FangSong" w:eastAsia="FangSong" w:cs="FangSong" w:hint="eastAsia"/>
+                <w:b w:val="0"/>
+                <w:i w:val="0"/>
+                <w:color w:val="202020"/>
+                <w:sz w:val="18"/>
+                <w:lang w:val="zh-CN" w:eastAsia="zh-CN" w:bidi="ar-SA"/>
+              </w:rPr>
+              <w:t>NeoWorker Native SessionRuntime</w:t>
+            </w:r>
+          </w:p>
+        </w:tc>
+        <w:tc>
+          <w:tcPr>
+            <w:tcW w:type="dxa" w:w="1800"/>
+            <w:tcBorders>
+              <w:top w:val="single" w:sz="6" w:space="0" w:color="D9D9D9"/>
+              <w:left w:val="single" w:sz="6" w:space="0" w:color="D9D9D9"/>
+              <w:bottom w:val="single" w:sz="6" w:space="0" w:color="D9D9D9"/>
+              <w:right w:val="single" w:sz="6" w:space="0" w:color="D9D9D9"/>
+              <w:insideH w:val="single" w:sz="6" w:space="0" w:color="D9D9D9"/>
+              <w:insideV w:val="single" w:sz="6" w:space="0" w:color="D9D9D9"/>
+            </w:tcBorders>
+            <w:tcMar>
+              <w:top w:w="105" w:type="dxa"/>
+              <w:start w:w="130" w:type="dxa"/>
+              <w:bottom w:w="105" w:type="dxa"/>
+              <w:end w:w="130" w:type="dxa"/>
+            </w:tcMar>
+            <w:vAlign w:val="center"/>
+          </w:tcPr>
+          <w:p>
+            <w:pPr>
+              <w:keepLines/>
+              <w:spacing w:before="0" w:after="0" w:line="259" w:lineRule="auto"/>
+              <w:ind w:left="0" w:firstLine="0"/>
+              <w:jc w:val="left"/>
+            </w:pPr>
+            <w:r>
+              <w:rPr>
+                <w:rFonts w:ascii="FangSong" w:hAnsi="FangSong" w:eastAsia="FangSong" w:cs="FangSong" w:hint="eastAsia"/>
+                <w:b w:val="0"/>
+                <w:i w:val="0"/>
+                <w:color w:val="202020"/>
+                <w:sz w:val="18"/>
+                <w:lang w:val="zh-CN" w:eastAsia="zh-CN" w:bidi="ar-SA"/>
+              </w:rPr>
+              <w:t>NeoWorker</w:t>
+            </w:r>
+          </w:p>
+        </w:tc>
+        <w:tc>
+          <w:tcPr>
+            <w:tcW w:type="dxa" w:w="2232"/>
+            <w:tcBorders>
+              <w:top w:val="single" w:sz="6" w:space="0" w:color="D9D9D9"/>
+              <w:left w:val="single" w:sz="6" w:space="0" w:color="D9D9D9"/>
+              <w:bottom w:val="single" w:sz="6" w:space="0" w:color="D9D9D9"/>
+              <w:right w:val="single" w:sz="6" w:space="0" w:color="D9D9D9"/>
+              <w:insideH w:val="single" w:sz="6" w:space="0" w:color="D9D9D9"/>
+              <w:insideV w:val="single" w:sz="6" w:space="0" w:color="D9D9D9"/>
+            </w:tcBorders>
+            <w:tcMar>
+              <w:top w:w="105" w:type="dxa"/>
+              <w:start w:w="130" w:type="dxa"/>
+              <w:bottom w:w="105" w:type="dxa"/>
+              <w:end w:w="130" w:type="dxa"/>
+            </w:tcMar>
+            <w:vAlign w:val="center"/>
+          </w:tcPr>
+          <w:p>
+            <w:pPr>
+              <w:keepLines/>
+              <w:spacing w:before="0" w:after="0" w:line="259" w:lineRule="auto"/>
+              <w:ind w:left="0" w:firstLine="0"/>
+              <w:jc w:val="left"/>
+            </w:pPr>
+            <w:r>
+              <w:rPr>
+                <w:rFonts w:ascii="FangSong" w:hAnsi="FangSong" w:eastAsia="FangSong" w:cs="FangSong" w:hint="eastAsia"/>
+                <w:b w:val="0"/>
+                <w:i w:val="0"/>
+                <w:color w:val="202020"/>
+                <w:sz w:val="18"/>
+                <w:lang w:val="zh-CN" w:eastAsia="zh-CN" w:bidi="ar-SA"/>
+              </w:rPr>
+              <w:t>NeoWorker</w:t>
+            </w:r>
+          </w:p>
+        </w:tc>
+        <w:tc>
+          <w:tcPr>
+            <w:tcW w:type="dxa" w:w="3585"/>
+            <w:tcBorders>
+              <w:top w:val="single" w:sz="6" w:space="0" w:color="D9D9D9"/>
+              <w:left w:val="single" w:sz="6" w:space="0" w:color="D9D9D9"/>
+              <w:bottom w:val="single" w:sz="6" w:space="0" w:color="D9D9D9"/>
+              <w:right w:val="single" w:sz="6" w:space="0" w:color="D9D9D9"/>
+              <w:insideH w:val="single" w:sz="6" w:space="0" w:color="D9D9D9"/>
+              <w:insideV w:val="single" w:sz="6" w:space="0" w:color="D9D9D9"/>
+            </w:tcBorders>
+            <w:tcMar>
+              <w:top w:w="105" w:type="dxa"/>
+              <w:start w:w="130" w:type="dxa"/>
+              <w:bottom w:w="105" w:type="dxa"/>
+              <w:end w:w="130" w:type="dxa"/>
+            </w:tcMar>
+            <w:vAlign w:val="center"/>
+          </w:tcPr>
+          <w:p>
+            <w:pPr>
+              <w:keepLines/>
+              <w:spacing w:before="0" w:after="0" w:line="259" w:lineRule="auto"/>
+              <w:ind w:left="0" w:firstLine="0"/>
+              <w:jc w:val="left"/>
+            </w:pPr>
+            <w:r>
+              <w:rPr>
+                <w:rFonts w:ascii="FangSong" w:hAnsi="FangSong" w:eastAsia="FangSong" w:cs="FangSong" w:hint="eastAsia"/>
+                <w:b w:val="0"/>
+                <w:i w:val="0"/>
+                <w:color w:val="202020"/>
+                <w:sz w:val="18"/>
+                <w:lang w:val="zh-CN" w:eastAsia="zh-CN" w:bidi="ar-SA"/>
+              </w:rPr>
+              <w:t>历史任务兼容和内部保底路径</w:t>
             </w:r>
           </w:p>
         </w:tc>
@@ -1242,14 +1242,14 @@
       </w:pPr>
       <w:r>
         <w:rPr>
-          <w:rFonts w:ascii="STSong" w:hAnsi="STSong" w:eastAsia="STSong" w:cs="STSong" w:hint="eastAsia"/>
+          <w:rFonts w:ascii="FangSong" w:hAnsi="FangSong" w:eastAsia="FangSong" w:cs="FangSong" w:hint="eastAsia"/>
           <w:b w:val="0"/>
           <w:i w:val="0"/>
           <w:color w:val="202020"/>
           <w:sz w:val="21"/>
           <w:lang w:val="zh-CN" w:eastAsia="zh-CN" w:bidi="ar-SA"/>
         </w:rPr>
-        <w:t>从当前本地任务数据看，普通任务仍然没有进入 Hermes：已检查的任务中没有带有 Hermes external runtime 的任务，之前的航班查询也走的是 NeoWorker 原生 SessionRuntime。因此，之前截图中的差异更准确地说明“产品默认路由还没有启用 Hermes”，而不是说明 Hermes ACP 适配本身不可用。</w:t>
+        <w:t>当前实现已经把新任务的默认路由固定到内置 Hermes：任务创建时绑定 Hermes ACP 配置，执行时通过随 NeoWorker 安装包交付的 Host 启动，不依赖用户另外安装 Hermes Agent。旧任务仍可能保留 Native 或外部 Runtime 元数据，因此历史记录中出现不同 Runtime 是兼容行为，不代表新任务还在按复杂度自动分流。</w:t>
       </w:r>
     </w:p>
     <w:p>
@@ -1260,14 +1260,14 @@
       </w:pPr>
       <w:r>
         <w:rPr>
-          <w:rFonts w:ascii="STSong" w:hAnsi="STSong" w:eastAsia="STSong" w:cs="STSong" w:hint="eastAsia"/>
+          <w:rFonts w:ascii="FangSong" w:hAnsi="FangSong" w:eastAsia="FangSong" w:cs="FangSong" w:hint="eastAsia"/>
           <w:b w:val="0"/>
           <w:i w:val="0"/>
           <w:color w:val="202020"/>
           <w:sz w:val="21"/>
           <w:lang w:val="zh-CN" w:eastAsia="zh-CN" w:bidi="ar-SA"/>
         </w:rPr>
-        <w:t>另一方面，仓库中的专项验证已经证明 ACP 宿主工具链可以工作：本机 Hermes Agent v0.18.0 能通过 NeoWorker Tool Host 完成 write_file 和 run_command，审批、工具生命周期、checkpoint 和结果边界均有验证。当前状态可以概括为：集成基础已具备，产品采用率仍接近零。</w:t>
+        <w:t>专项验证已经覆盖内置 Hermes Host 的启动、ACP 工具桥接、审批、工具生命周期、checkpoint、恢复、Shell 和安装包 smoke。当前状态可以概括为：新任务统一使用内置 Hermes，Native 仅保留兼容语义，后续工作集中在真实任务质量和能力覆盖。</w:t>
       </w:r>
     </w:p>
     <w:p>
@@ -1277,7 +1277,7 @@
       </w:pPr>
       <w:r>
         <w:rPr>
-          <w:rFonts w:ascii="STSong" w:hAnsi="STSong" w:eastAsia="STSong" w:cs="STSong" w:hint="eastAsia"/>
+          <w:rFonts w:ascii="FangSong" w:hAnsi="FangSong" w:eastAsia="FangSong" w:cs="FangSong" w:hint="eastAsia"/>
           <w:b w:val="0"/>
           <w:i w:val="0"/>
           <w:color w:val="202020"/>
@@ -1295,7 +1295,7 @@
       </w:pPr>
       <w:r>
         <w:rPr>
-          <w:rFonts w:ascii="STSong" w:hAnsi="STSong" w:eastAsia="STSong" w:cs="STSong" w:hint="eastAsia"/>
+          <w:rFonts w:ascii="FangSong" w:hAnsi="FangSong" w:eastAsia="FangSong" w:cs="FangSong" w:hint="eastAsia"/>
           <w:b/>
           <w:i w:val="0"/>
           <w:color w:val="202020"/>
@@ -1313,7 +1313,7 @@
       </w:pPr>
       <w:r>
         <w:rPr>
-          <w:rFonts w:ascii="STSong" w:hAnsi="STSong" w:eastAsia="STSong" w:cs="STSong" w:hint="eastAsia"/>
+          <w:rFonts w:ascii="FangSong" w:hAnsi="FangSong" w:eastAsia="FangSong" w:cs="FangSong" w:hint="eastAsia"/>
           <w:b w:val="0"/>
           <w:i w:val="0"/>
           <w:color w:val="202020"/>
@@ -1368,7 +1368,7 @@
             </w:pPr>
             <w:r>
               <w:rPr>
-                <w:rFonts w:ascii="STSong" w:hAnsi="STSong" w:eastAsia="STSong" w:cs="STSong" w:hint="eastAsia"/>
+                <w:rFonts w:ascii="FangSong" w:hAnsi="FangSong" w:eastAsia="FangSong" w:cs="FangSong" w:hint="eastAsia"/>
                 <w:b/>
                 <w:i w:val="0"/>
                 <w:color w:val="FFFFFF"/>
@@ -1407,7 +1407,7 @@
             </w:pPr>
             <w:r>
               <w:rPr>
-                <w:rFonts w:ascii="STSong" w:hAnsi="STSong" w:eastAsia="STSong" w:cs="STSong" w:hint="eastAsia"/>
+                <w:rFonts w:ascii="FangSong" w:hAnsi="FangSong" w:eastAsia="FangSong" w:cs="FangSong" w:hint="eastAsia"/>
                 <w:b/>
                 <w:i w:val="0"/>
                 <w:color w:val="FFFFFF"/>
@@ -1446,7 +1446,7 @@
             </w:pPr>
             <w:r>
               <w:rPr>
-                <w:rFonts w:ascii="STSong" w:hAnsi="STSong" w:eastAsia="STSong" w:cs="STSong" w:hint="eastAsia"/>
+                <w:rFonts w:ascii="FangSong" w:hAnsi="FangSong" w:eastAsia="FangSong" w:cs="FangSong" w:hint="eastAsia"/>
                 <w:b/>
                 <w:i w:val="0"/>
                 <w:color w:val="FFFFFF"/>
@@ -1487,7 +1487,7 @@
             </w:pPr>
             <w:r>
               <w:rPr>
-                <w:rFonts w:ascii="STSong" w:hAnsi="STSong" w:eastAsia="STSong" w:cs="STSong" w:hint="eastAsia"/>
+                <w:rFonts w:ascii="FangSong" w:hAnsi="FangSong" w:eastAsia="FangSong" w:cs="FangSong" w:hint="eastAsia"/>
                 <w:b w:val="0"/>
                 <w:i w:val="0"/>
                 <w:color w:val="202020"/>
@@ -1526,7 +1526,7 @@
             </w:pPr>
             <w:r>
               <w:rPr>
-                <w:rFonts w:ascii="STSong" w:hAnsi="STSong" w:eastAsia="STSong" w:cs="STSong" w:hint="eastAsia"/>
+                <w:rFonts w:ascii="FangSong" w:hAnsi="FangSong" w:eastAsia="FangSong" w:cs="FangSong" w:hint="eastAsia"/>
                 <w:b w:val="0"/>
                 <w:i w:val="0"/>
                 <w:color w:val="202020"/>
@@ -1565,7 +1565,7 @@
             </w:pPr>
             <w:r>
               <w:rPr>
-                <w:rFonts w:ascii="STSong" w:hAnsi="STSong" w:eastAsia="STSong" w:cs="STSong" w:hint="eastAsia"/>
+                <w:rFonts w:ascii="FangSong" w:hAnsi="FangSong" w:eastAsia="FangSong" w:cs="FangSong" w:hint="eastAsia"/>
                 <w:b w:val="0"/>
                 <w:i w:val="0"/>
                 <w:color w:val="202020"/>
@@ -1607,7 +1607,7 @@
             </w:pPr>
             <w:r>
               <w:rPr>
-                <w:rFonts w:ascii="STSong" w:hAnsi="STSong" w:eastAsia="STSong" w:cs="STSong" w:hint="eastAsia"/>
+                <w:rFonts w:ascii="FangSong" w:hAnsi="FangSong" w:eastAsia="FangSong" w:cs="FangSong" w:hint="eastAsia"/>
                 <w:b w:val="0"/>
                 <w:i w:val="0"/>
                 <w:color w:val="202020"/>
@@ -1647,7 +1647,7 @@
             </w:pPr>
             <w:r>
               <w:rPr>
-                <w:rFonts w:ascii="STSong" w:hAnsi="STSong" w:eastAsia="STSong" w:cs="STSong" w:hint="eastAsia"/>
+                <w:rFonts w:ascii="FangSong" w:hAnsi="FangSong" w:eastAsia="FangSong" w:cs="FangSong" w:hint="eastAsia"/>
                 <w:b w:val="0"/>
                 <w:i w:val="0"/>
                 <w:color w:val="202020"/>
@@ -1687,7 +1687,7 @@
             </w:pPr>
             <w:r>
               <w:rPr>
-                <w:rFonts w:ascii="STSong" w:hAnsi="STSong" w:eastAsia="STSong" w:cs="STSong" w:hint="eastAsia"/>
+                <w:rFonts w:ascii="FangSong" w:hAnsi="FangSong" w:eastAsia="FangSong" w:cs="FangSong" w:hint="eastAsia"/>
                 <w:b w:val="0"/>
                 <w:i w:val="0"/>
                 <w:color w:val="202020"/>
@@ -1728,7 +1728,7 @@
             </w:pPr>
             <w:r>
               <w:rPr>
-                <w:rFonts w:ascii="STSong" w:hAnsi="STSong" w:eastAsia="STSong" w:cs="STSong" w:hint="eastAsia"/>
+                <w:rFonts w:ascii="FangSong" w:hAnsi="FangSong" w:eastAsia="FangSong" w:cs="FangSong" w:hint="eastAsia"/>
                 <w:b w:val="0"/>
                 <w:i w:val="0"/>
                 <w:color w:val="202020"/>
@@ -1767,7 +1767,7 @@
             </w:pPr>
             <w:r>
               <w:rPr>
-                <w:rFonts w:ascii="STSong" w:hAnsi="STSong" w:eastAsia="STSong" w:cs="STSong" w:hint="eastAsia"/>
+                <w:rFonts w:ascii="FangSong" w:hAnsi="FangSong" w:eastAsia="FangSong" w:cs="FangSong" w:hint="eastAsia"/>
                 <w:b w:val="0"/>
                 <w:i w:val="0"/>
                 <w:color w:val="202020"/>
@@ -1806,7 +1806,7 @@
             </w:pPr>
             <w:r>
               <w:rPr>
-                <w:rFonts w:ascii="STSong" w:hAnsi="STSong" w:eastAsia="STSong" w:cs="STSong" w:hint="eastAsia"/>
+                <w:rFonts w:ascii="FangSong" w:hAnsi="FangSong" w:eastAsia="FangSong" w:cs="FangSong" w:hint="eastAsia"/>
                 <w:b w:val="0"/>
                 <w:i w:val="0"/>
                 <w:color w:val="202020"/>
@@ -1848,7 +1848,7 @@
             </w:pPr>
             <w:r>
               <w:rPr>
-                <w:rFonts w:ascii="STSong" w:hAnsi="STSong" w:eastAsia="STSong" w:cs="STSong" w:hint="eastAsia"/>
+                <w:rFonts w:ascii="FangSong" w:hAnsi="FangSong" w:eastAsia="FangSong" w:cs="FangSong" w:hint="eastAsia"/>
                 <w:b w:val="0"/>
                 <w:i w:val="0"/>
                 <w:color w:val="202020"/>
@@ -1888,7 +1888,7 @@
             </w:pPr>
             <w:r>
               <w:rPr>
-                <w:rFonts w:ascii="STSong" w:hAnsi="STSong" w:eastAsia="STSong" w:cs="STSong" w:hint="eastAsia"/>
+                <w:rFonts w:ascii="FangSong" w:hAnsi="FangSong" w:eastAsia="FangSong" w:cs="FangSong" w:hint="eastAsia"/>
                 <w:b w:val="0"/>
                 <w:i w:val="0"/>
                 <w:color w:val="202020"/>
@@ -1928,7 +1928,7 @@
             </w:pPr>
             <w:r>
               <w:rPr>
-                <w:rFonts w:ascii="STSong" w:hAnsi="STSong" w:eastAsia="STSong" w:cs="STSong" w:hint="eastAsia"/>
+                <w:rFonts w:ascii="FangSong" w:hAnsi="FangSong" w:eastAsia="FangSong" w:cs="FangSong" w:hint="eastAsia"/>
                 <w:b w:val="0"/>
                 <w:i w:val="0"/>
                 <w:color w:val="202020"/>
@@ -1969,7 +1969,7 @@
             </w:pPr>
             <w:r>
               <w:rPr>
-                <w:rFonts w:ascii="STSong" w:hAnsi="STSong" w:eastAsia="STSong" w:cs="STSong" w:hint="eastAsia"/>
+                <w:rFonts w:ascii="FangSong" w:hAnsi="FangSong" w:eastAsia="FangSong" w:cs="FangSong" w:hint="eastAsia"/>
                 <w:b w:val="0"/>
                 <w:i w:val="0"/>
                 <w:color w:val="202020"/>
@@ -2008,7 +2008,7 @@
             </w:pPr>
             <w:r>
               <w:rPr>
-                <w:rFonts w:ascii="STSong" w:hAnsi="STSong" w:eastAsia="STSong" w:cs="STSong" w:hint="eastAsia"/>
+                <w:rFonts w:ascii="FangSong" w:hAnsi="FangSong" w:eastAsia="FangSong" w:cs="FangSong" w:hint="eastAsia"/>
                 <w:b w:val="0"/>
                 <w:i w:val="0"/>
                 <w:color w:val="202020"/>
@@ -2047,14 +2047,14 @@
             </w:pPr>
             <w:r>
               <w:rPr>
-                <w:rFonts w:ascii="STSong" w:hAnsi="STSong" w:eastAsia="STSong" w:cs="STSong" w:hint="eastAsia"/>
+                <w:rFonts w:ascii="FangSong" w:hAnsi="FangSong" w:eastAsia="FangSong" w:cs="FangSong" w:hint="eastAsia"/>
                 <w:b w:val="0"/>
                 <w:i w:val="0"/>
                 <w:color w:val="202020"/>
                 <w:sz w:val="18"/>
                 <w:lang w:val="zh-CN" w:eastAsia="zh-CN" w:bidi="ar-SA"/>
               </w:rPr>
-              <w:t>明确显示 Native、Hermes Active、Fallback 或 Failed</w:t>
+              <w:t>不展示运行时选择；时间线只展示实际运行状态、失败和历史回退</w:t>
             </w:r>
           </w:p>
         </w:tc>
@@ -2089,7 +2089,7 @@
             </w:pPr>
             <w:r>
               <w:rPr>
-                <w:rFonts w:ascii="STSong" w:hAnsi="STSong" w:eastAsia="STSong" w:cs="STSong" w:hint="eastAsia"/>
+                <w:rFonts w:ascii="FangSong" w:hAnsi="FangSong" w:eastAsia="FangSong" w:cs="FangSong" w:hint="eastAsia"/>
                 <w:b w:val="0"/>
                 <w:i w:val="0"/>
                 <w:color w:val="202020"/>
@@ -2129,7 +2129,7 @@
             </w:pPr>
             <w:r>
               <w:rPr>
-                <w:rFonts w:ascii="STSong" w:hAnsi="STSong" w:eastAsia="STSong" w:cs="STSong" w:hint="eastAsia"/>
+                <w:rFonts w:ascii="FangSong" w:hAnsi="FangSong" w:eastAsia="FangSong" w:cs="FangSong" w:hint="eastAsia"/>
                 <w:b w:val="0"/>
                 <w:i w:val="0"/>
                 <w:color w:val="202020"/>
@@ -2169,7 +2169,7 @@
             </w:pPr>
             <w:r>
               <w:rPr>
-                <w:rFonts w:ascii="STSong" w:hAnsi="STSong" w:eastAsia="STSong" w:cs="STSong" w:hint="eastAsia"/>
+                <w:rFonts w:ascii="FangSong" w:hAnsi="FangSong" w:eastAsia="FangSong" w:cs="FangSong" w:hint="eastAsia"/>
                 <w:b w:val="0"/>
                 <w:i w:val="0"/>
                 <w:color w:val="202020"/>
@@ -2195,14 +2195,14 @@
       </w:pPr>
       <w:r>
         <w:rPr>
-          <w:rFonts w:ascii="STSong" w:hAnsi="STSong" w:eastAsia="STSong" w:cs="STSong" w:hint="eastAsia"/>
+          <w:rFonts w:ascii="FangSong" w:hAnsi="FangSong" w:eastAsia="FangSong" w:cs="FangSong" w:hint="eastAsia"/>
           <w:b/>
           <w:i w:val="0"/>
           <w:color w:val="202020"/>
           <w:sz w:val="28"/>
           <w:lang w:val="zh-CN" w:eastAsia="zh-CN" w:bidi="ar-SA"/>
         </w:rPr>
-        <w:t>四 运行模式</w:t>
+        <w:t>四 运行时策略</w:t>
       </w:r>
     </w:p>
     <w:p>
@@ -2213,14 +2213,14 @@
       </w:pPr>
       <w:r>
         <w:rPr>
-          <w:rFonts w:ascii="STSong" w:hAnsi="STSong" w:eastAsia="STSong" w:cs="STSong" w:hint="eastAsia"/>
+          <w:rFonts w:ascii="FangSong" w:hAnsi="FangSong" w:eastAsia="FangSong" w:cs="FangSong" w:hint="eastAsia"/>
           <w:b w:val="0"/>
           <w:i w:val="0"/>
           <w:color w:val="202020"/>
           <w:sz w:val="21"/>
           <w:lang w:val="zh-CN" w:eastAsia="zh-CN" w:bidi="ar-SA"/>
         </w:rPr>
-        <w:t>建议在任务级别引入三种运行模式。模式必须持久化，并在任务时间线上留下可查询的运行时事件，避免用户根据界面猜测任务到底由谁执行。</w:t>
+        <w:t>运行时选择收回后端。新任务不再由前端选择，也不再按任务复杂度在 Hermes 和 Native 之间自适应切换；后端统一创建内置 Hermes 任务。历史任务和显式外部集成继续按已持久化的 Runtime 运行，并保留兼容性。</w:t>
       </w:r>
     </w:p>
     <w:tbl>
@@ -2243,7 +2243,7 @@
         </w:trPr>
         <w:tc>
           <w:tcPr>
-            <w:tcW w:type="dxa" w:w="1123"/>
+            <w:tcW w:type="dxa" w:w="1944"/>
             <w:tcBorders>
               <w:top w:val="single" w:sz="6" w:space="0" w:color="D9D9D9"/>
               <w:left w:val="single" w:sz="6" w:space="0" w:color="D9D9D9"/>
@@ -2269,20 +2269,20 @@
             </w:pPr>
             <w:r>
               <w:rPr>
-                <w:rFonts w:ascii="STSong" w:hAnsi="STSong" w:eastAsia="STSong" w:cs="STSong" w:hint="eastAsia"/>
+                <w:rFonts w:ascii="FangSong" w:hAnsi="FangSong" w:eastAsia="FangSong" w:cs="FangSong" w:hint="eastAsia"/>
                 <w:b/>
                 <w:i w:val="0"/>
                 <w:color w:val="FFFFFF"/>
                 <w:sz w:val="18"/>
                 <w:lang w:val="zh-CN" w:eastAsia="zh-CN" w:bidi="ar-SA"/>
               </w:rPr>
-              <w:t>模式</w:t>
+              <w:t>任务来源</w:t>
             </w:r>
           </w:p>
         </w:tc>
         <w:tc>
           <w:tcPr>
-            <w:tcW w:type="dxa" w:w="2664"/>
+            <w:tcW w:type="dxa" w:w="2476"/>
             <w:tcBorders>
               <w:top w:val="single" w:sz="6" w:space="0" w:color="D9D9D9"/>
               <w:left w:val="single" w:sz="6" w:space="0" w:color="D9D9D9"/>
@@ -2308,20 +2308,20 @@
             </w:pPr>
             <w:r>
               <w:rPr>
-                <w:rFonts w:ascii="STSong" w:hAnsi="STSong" w:eastAsia="STSong" w:cs="STSong" w:hint="eastAsia"/>
+                <w:rFonts w:ascii="FangSong" w:hAnsi="FangSong" w:eastAsia="FangSong" w:cs="FangSong" w:hint="eastAsia"/>
                 <w:b/>
                 <w:i w:val="0"/>
                 <w:color w:val="FFFFFF"/>
                 <w:sz w:val="18"/>
                 <w:lang w:val="zh-CN" w:eastAsia="zh-CN" w:bidi="ar-SA"/>
               </w:rPr>
-              <w:t>默认行为</w:t>
+              <w:t>运行时</w:t>
             </w:r>
           </w:p>
         </w:tc>
         <w:tc>
           <w:tcPr>
-            <w:tcW w:type="dxa" w:w="3960"/>
+            <w:tcW w:type="dxa" w:w="3340"/>
             <w:tcBorders>
               <w:top w:val="single" w:sz="6" w:space="0" w:color="D9D9D9"/>
               <w:left w:val="single" w:sz="6" w:space="0" w:color="D9D9D9"/>
@@ -2347,7 +2347,7 @@
             </w:pPr>
             <w:r>
               <w:rPr>
-                <w:rFonts w:ascii="STSong" w:hAnsi="STSong" w:eastAsia="STSong" w:cs="STSong" w:hint="eastAsia"/>
+                <w:rFonts w:ascii="FangSong" w:hAnsi="FangSong" w:eastAsia="FangSong" w:cs="FangSong" w:hint="eastAsia"/>
                 <w:b/>
                 <w:i w:val="0"/>
                 <w:color w:val="FFFFFF"/>
@@ -2360,7 +2360,7 @@
         </w:tc>
         <w:tc>
           <w:tcPr>
-            <w:tcW w:type="dxa" w:w="2102"/>
+            <w:tcW w:type="dxa" w:w="2088"/>
             <w:tcBorders>
               <w:top w:val="single" w:sz="6" w:space="0" w:color="D9D9D9"/>
               <w:left w:val="single" w:sz="6" w:space="0" w:color="D9D9D9"/>
@@ -2386,7 +2386,7 @@
             </w:pPr>
             <w:r>
               <w:rPr>
-                <w:rFonts w:ascii="STSong" w:hAnsi="STSong" w:eastAsia="STSong" w:cs="STSong" w:hint="eastAsia"/>
+                <w:rFonts w:ascii="FangSong" w:hAnsi="FangSong" w:eastAsia="FangSong" w:cs="FangSong" w:hint="eastAsia"/>
                 <w:b/>
                 <w:i w:val="0"/>
                 <w:color w:val="FFFFFF"/>
@@ -2401,7 +2401,7 @@
       <w:tr>
         <w:tc>
           <w:tcPr>
-            <w:tcW w:type="dxa" w:w="1123"/>
+            <w:tcW w:type="dxa" w:w="1944"/>
             <w:tcBorders>
               <w:top w:val="single" w:sz="6" w:space="0" w:color="D9D9D9"/>
               <w:left w:val="single" w:sz="6" w:space="0" w:color="D9D9D9"/>
@@ -2427,20 +2427,20 @@
             </w:pPr>
             <w:r>
               <w:rPr>
-                <w:rFonts w:ascii="STSong" w:hAnsi="STSong" w:eastAsia="STSong" w:cs="STSong" w:hint="eastAsia"/>
+                <w:rFonts w:ascii="FangSong" w:hAnsi="FangSong" w:eastAsia="FangSong" w:cs="FangSong" w:hint="eastAsia"/>
                 <w:b w:val="0"/>
                 <w:i w:val="0"/>
                 <w:color w:val="202020"/>
                 <w:sz w:val="18"/>
                 <w:lang w:val="zh-CN" w:eastAsia="zh-CN" w:bidi="ar-SA"/>
               </w:rPr>
-              <w:t>Auto</w:t>
+              <w:t>新任务</w:t>
             </w:r>
           </w:p>
         </w:tc>
         <w:tc>
           <w:tcPr>
-            <w:tcW w:type="dxa" w:w="2664"/>
+            <w:tcW w:type="dxa" w:w="2476"/>
             <w:tcBorders>
               <w:top w:val="single" w:sz="6" w:space="0" w:color="D9D9D9"/>
               <w:left w:val="single" w:sz="6" w:space="0" w:color="D9D9D9"/>
@@ -2466,20 +2466,20 @@
             </w:pPr>
             <w:r>
               <w:rPr>
-                <w:rFonts w:ascii="STSong" w:hAnsi="STSong" w:eastAsia="STSong" w:cs="STSong" w:hint="eastAsia"/>
+                <w:rFonts w:ascii="FangSong" w:hAnsi="FangSong" w:eastAsia="FangSong" w:cs="FangSong" w:hint="eastAsia"/>
                 <w:b w:val="0"/>
                 <w:i w:val="0"/>
                 <w:color w:val="202020"/>
                 <w:sz w:val="18"/>
                 <w:lang w:val="zh-CN" w:eastAsia="zh-CN" w:bidi="ar-SA"/>
               </w:rPr>
-              <w:t>根据任务特征自动选择</w:t>
+              <w:t>NeoWorker 内置 Hermes ACP</w:t>
             </w:r>
           </w:p>
         </w:tc>
         <w:tc>
           <w:tcPr>
-            <w:tcW w:type="dxa" w:w="3960"/>
+            <w:tcW w:type="dxa" w:w="3340"/>
             <w:tcBorders>
               <w:top w:val="single" w:sz="6" w:space="0" w:color="D9D9D9"/>
               <w:left w:val="single" w:sz="6" w:space="0" w:color="D9D9D9"/>
@@ -2505,20 +2505,20 @@
             </w:pPr>
             <w:r>
               <w:rPr>
-                <w:rFonts w:ascii="STSong" w:hAnsi="STSong" w:eastAsia="STSong" w:cs="STSong" w:hint="eastAsia"/>
+                <w:rFonts w:ascii="FangSong" w:hAnsi="FangSong" w:eastAsia="FangSong" w:cs="FangSong" w:hint="eastAsia"/>
                 <w:b w:val="0"/>
                 <w:i w:val="0"/>
                 <w:color w:val="202020"/>
                 <w:sz w:val="18"/>
                 <w:lang w:val="zh-CN" w:eastAsia="zh-CN" w:bidi="ar-SA"/>
               </w:rPr>
-              <w:t>复杂查询、网页研究、代码和多步文件任务优先 Hermes</w:t>
+              <w:t>所有普通对话、网页、代码和 Office 任务</w:t>
             </w:r>
           </w:p>
         </w:tc>
         <w:tc>
           <w:tcPr>
-            <w:tcW w:type="dxa" w:w="2102"/>
+            <w:tcW w:type="dxa" w:w="2088"/>
             <w:tcBorders>
               <w:top w:val="single" w:sz="6" w:space="0" w:color="D9D9D9"/>
               <w:left w:val="single" w:sz="6" w:space="0" w:color="D9D9D9"/>
@@ -2544,14 +2544,14 @@
             </w:pPr>
             <w:r>
               <w:rPr>
-                <w:rFonts w:ascii="STSong" w:hAnsi="STSong" w:eastAsia="STSong" w:cs="STSong" w:hint="eastAsia"/>
+                <w:rFonts w:ascii="FangSong" w:hAnsi="FangSong" w:eastAsia="FangSong" w:cs="FangSong" w:hint="eastAsia"/>
                 <w:b w:val="0"/>
                 <w:i w:val="0"/>
                 <w:color w:val="202020"/>
                 <w:sz w:val="18"/>
                 <w:lang w:val="zh-CN" w:eastAsia="zh-CN" w:bidi="ar-SA"/>
               </w:rPr>
-              <w:t>低风险任务可按策略降级；必须记录原因</w:t>
+              <w:t>Hermes 启动或执行失败即失败，不静默切 Native</w:t>
             </w:r>
           </w:p>
         </w:tc>
@@ -2559,7 +2559,7 @@
       <w:tr>
         <w:tc>
           <w:tcPr>
-            <w:tcW w:type="dxa" w:w="1123"/>
+            <w:tcW w:type="dxa" w:w="1944"/>
             <w:tcBorders>
               <w:top w:val="single" w:sz="6" w:space="0" w:color="D9D9D9"/>
               <w:left w:val="single" w:sz="6" w:space="0" w:color="D9D9D9"/>
@@ -2586,20 +2586,20 @@
             </w:pPr>
             <w:r>
               <w:rPr>
-                <w:rFonts w:ascii="STSong" w:hAnsi="STSong" w:eastAsia="STSong" w:cs="STSong" w:hint="eastAsia"/>
+                <w:rFonts w:ascii="FangSong" w:hAnsi="FangSong" w:eastAsia="FangSong" w:cs="FangSong" w:hint="eastAsia"/>
                 <w:b w:val="0"/>
                 <w:i w:val="0"/>
                 <w:color w:val="202020"/>
                 <w:sz w:val="18"/>
                 <w:lang w:val="zh-CN" w:eastAsia="zh-CN" w:bidi="ar-SA"/>
               </w:rPr>
-              <w:t>Hermes</w:t>
+              <w:t>历史 Native 任务</w:t>
             </w:r>
           </w:p>
         </w:tc>
         <w:tc>
           <w:tcPr>
-            <w:tcW w:type="dxa" w:w="2664"/>
+            <w:tcW w:type="dxa" w:w="2476"/>
             <w:tcBorders>
               <w:top w:val="single" w:sz="6" w:space="0" w:color="D9D9D9"/>
               <w:left w:val="single" w:sz="6" w:space="0" w:color="D9D9D9"/>
@@ -2626,20 +2626,20 @@
             </w:pPr>
             <w:r>
               <w:rPr>
-                <w:rFonts w:ascii="STSong" w:hAnsi="STSong" w:eastAsia="STSong" w:cs="STSong" w:hint="eastAsia"/>
+                <w:rFonts w:ascii="FangSong" w:hAnsi="FangSong" w:eastAsia="FangSong" w:cs="FangSong" w:hint="eastAsia"/>
                 <w:b w:val="0"/>
                 <w:i w:val="0"/>
                 <w:color w:val="202020"/>
                 <w:sz w:val="18"/>
                 <w:lang w:val="zh-CN" w:eastAsia="zh-CN" w:bidi="ar-SA"/>
               </w:rPr>
-              <w:t>强制走 Hermes ACP</w:t>
+              <w:t>NeoWorker Native SessionRuntime</w:t>
             </w:r>
           </w:p>
         </w:tc>
         <w:tc>
           <w:tcPr>
-            <w:tcW w:type="dxa" w:w="3960"/>
+            <w:tcW w:type="dxa" w:w="3340"/>
             <w:tcBorders>
               <w:top w:val="single" w:sz="6" w:space="0" w:color="D9D9D9"/>
               <w:left w:val="single" w:sz="6" w:space="0" w:color="D9D9D9"/>
@@ -2666,20 +2666,20 @@
             </w:pPr>
             <w:r>
               <w:rPr>
-                <w:rFonts w:ascii="STSong" w:hAnsi="STSong" w:eastAsia="STSong" w:cs="STSong" w:hint="eastAsia"/>
+                <w:rFonts w:ascii="FangSong" w:hAnsi="FangSong" w:eastAsia="FangSong" w:cs="FangSong" w:hint="eastAsia"/>
                 <w:b w:val="0"/>
                 <w:i w:val="0"/>
                 <w:color w:val="202020"/>
                 <w:sz w:val="18"/>
                 <w:lang w:val="zh-CN" w:eastAsia="zh-CN" w:bidi="ar-SA"/>
               </w:rPr>
-              <w:t>用户明确要求 Hermes，或任务需要 Hermes 的多步执行能力</w:t>
+              <w:t>保持已有会话和历史任务语义</w:t>
             </w:r>
           </w:p>
         </w:tc>
         <w:tc>
           <w:tcPr>
-            <w:tcW w:type="dxa" w:w="2102"/>
+            <w:tcW w:type="dxa" w:w="2088"/>
             <w:tcBorders>
               <w:top w:val="single" w:sz="6" w:space="0" w:color="D9D9D9"/>
               <w:left w:val="single" w:sz="6" w:space="0" w:color="D9D9D9"/>
@@ -2706,14 +2706,14 @@
             </w:pPr>
             <w:r>
               <w:rPr>
-                <w:rFonts w:ascii="STSong" w:hAnsi="STSong" w:eastAsia="STSong" w:cs="STSong" w:hint="eastAsia"/>
+                <w:rFonts w:ascii="FangSong" w:hAnsi="FangSong" w:eastAsia="FangSong" w:cs="FangSong" w:hint="eastAsia"/>
                 <w:b w:val="0"/>
                 <w:i w:val="0"/>
                 <w:color w:val="202020"/>
                 <w:sz w:val="18"/>
                 <w:lang w:val="zh-CN" w:eastAsia="zh-CN" w:bidi="ar-SA"/>
               </w:rPr>
-              <w:t>不允许静默降级；启动失败应明确显示</w:t>
+              <w:t>沿用原生暂停、恢复和错误语义</w:t>
             </w:r>
           </w:p>
         </w:tc>
@@ -2721,7 +2721,7 @@
       <w:tr>
         <w:tc>
           <w:tcPr>
-            <w:tcW w:type="dxa" w:w="1123"/>
+            <w:tcW w:type="dxa" w:w="1944"/>
             <w:tcBorders>
               <w:top w:val="single" w:sz="6" w:space="0" w:color="D9D9D9"/>
               <w:left w:val="single" w:sz="6" w:space="0" w:color="D9D9D9"/>
@@ -2747,20 +2747,20 @@
             </w:pPr>
             <w:r>
               <w:rPr>
-                <w:rFonts w:ascii="STSong" w:hAnsi="STSong" w:eastAsia="STSong" w:cs="STSong" w:hint="eastAsia"/>
+                <w:rFonts w:ascii="FangSong" w:hAnsi="FangSong" w:eastAsia="FangSong" w:cs="FangSong" w:hint="eastAsia"/>
                 <w:b w:val="0"/>
                 <w:i w:val="0"/>
                 <w:color w:val="202020"/>
                 <w:sz w:val="18"/>
                 <w:lang w:val="zh-CN" w:eastAsia="zh-CN" w:bidi="ar-SA"/>
               </w:rPr>
-              <w:t>Native</w:t>
+              <w:t>显式外部 ACP 任务</w:t>
             </w:r>
           </w:p>
         </w:tc>
         <w:tc>
           <w:tcPr>
-            <w:tcW w:type="dxa" w:w="2664"/>
+            <w:tcW w:type="dxa" w:w="2476"/>
             <w:tcBorders>
               <w:top w:val="single" w:sz="6" w:space="0" w:color="D9D9D9"/>
               <w:left w:val="single" w:sz="6" w:space="0" w:color="D9D9D9"/>
@@ -2786,20 +2786,20 @@
             </w:pPr>
             <w:r>
               <w:rPr>
-                <w:rFonts w:ascii="STSong" w:hAnsi="STSong" w:eastAsia="STSong" w:cs="STSong" w:hint="eastAsia"/>
+                <w:rFonts w:ascii="FangSong" w:hAnsi="FangSong" w:eastAsia="FangSong" w:cs="FangSong" w:hint="eastAsia"/>
                 <w:b w:val="0"/>
                 <w:i w:val="0"/>
                 <w:color w:val="202020"/>
                 <w:sz w:val="18"/>
                 <w:lang w:val="zh-CN" w:eastAsia="zh-CN" w:bidi="ar-SA"/>
               </w:rPr>
-              <w:t>走 NeoWorker 原生 Runtime</w:t>
+              <w:t>按外部 Runtime 配置</w:t>
             </w:r>
           </w:p>
         </w:tc>
         <w:tc>
           <w:tcPr>
-            <w:tcW w:type="dxa" w:w="3960"/>
+            <w:tcW w:type="dxa" w:w="3340"/>
             <w:tcBorders>
               <w:top w:val="single" w:sz="6" w:space="0" w:color="D9D9D9"/>
               <w:left w:val="single" w:sz="6" w:space="0" w:color="D9D9D9"/>
@@ -2825,20 +2825,20 @@
             </w:pPr>
             <w:r>
               <w:rPr>
-                <w:rFonts w:ascii="STSong" w:hAnsi="STSong" w:eastAsia="STSong" w:cs="STSong" w:hint="eastAsia"/>
+                <w:rFonts w:ascii="FangSong" w:hAnsi="FangSong" w:eastAsia="FangSong" w:cs="FangSong" w:hint="eastAsia"/>
                 <w:b w:val="0"/>
                 <w:i w:val="0"/>
                 <w:color w:val="202020"/>
                 <w:sz w:val="18"/>
                 <w:lang w:val="zh-CN" w:eastAsia="zh-CN" w:bidi="ar-SA"/>
               </w:rPr>
-              <w:t>简单问答、单步操作、确定性工作流和调试场景</w:t>
+              <w:t>旧集成、内部调度或明确委托的任务</w:t>
             </w:r>
           </w:p>
         </w:tc>
         <w:tc>
           <w:tcPr>
-            <w:tcW w:type="dxa" w:w="2102"/>
+            <w:tcW w:type="dxa" w:w="2088"/>
             <w:tcBorders>
               <w:top w:val="single" w:sz="6" w:space="0" w:color="D9D9D9"/>
               <w:left w:val="single" w:sz="6" w:space="0" w:color="D9D9D9"/>
@@ -2864,14 +2864,14 @@
             </w:pPr>
             <w:r>
               <w:rPr>
-                <w:rFonts w:ascii="STSong" w:hAnsi="STSong" w:eastAsia="STSong" w:cs="STSong" w:hint="eastAsia"/>
+                <w:rFonts w:ascii="FangSong" w:hAnsi="FangSong" w:eastAsia="FangSong" w:cs="FangSong" w:hint="eastAsia"/>
                 <w:b w:val="0"/>
                 <w:i w:val="0"/>
                 <w:color w:val="202020"/>
                 <w:sz w:val="18"/>
                 <w:lang w:val="zh-CN" w:eastAsia="zh-CN" w:bidi="ar-SA"/>
               </w:rPr>
-              <w:t>保持现有原生错误和恢复语义</w:t>
+              <w:t>不改变外部契约；禁止无记录的隐式替换</w:t>
             </w:r>
           </w:p>
         </w:tc>
@@ -2890,7 +2890,7 @@
       </w:pPr>
       <w:r>
         <w:rPr>
-          <w:rFonts w:ascii="STSong" w:hAnsi="STSong" w:eastAsia="STSong" w:cs="STSong" w:hint="eastAsia"/>
+          <w:rFonts w:ascii="FangSong" w:hAnsi="FangSong" w:eastAsia="FangSong" w:cs="FangSong" w:hint="eastAsia"/>
           <w:b/>
           <w:i w:val="0"/>
           <w:color w:val="202020"/>
@@ -2901,14 +2901,14 @@
       </w:r>
       <w:r>
         <w:rPr>
-          <w:rFonts w:ascii="STSong" w:hAnsi="STSong" w:eastAsia="STSong" w:cs="STSong" w:hint="eastAsia"/>
+          <w:rFonts w:ascii="FangSong" w:hAnsi="FangSong" w:eastAsia="FangSong" w:cs="FangSong" w:hint="eastAsia"/>
           <w:b w:val="0"/>
           <w:i w:val="0"/>
           <w:color w:val="202020"/>
           <w:sz w:val="21"/>
           <w:lang w:val="zh-CN" w:eastAsia="zh-CN" w:bidi="ar-SA"/>
         </w:rPr>
-        <w:t>先按任务复杂度和工具数量判断，再结合工具类型、用户选择和历史失败情况修正。模型供应商或 Provider 名称不能作为“是否使用 Hermes Harness”的唯一信号。</w:t>
+        <w:t>新任务的唯一默认判断是“使用内置 Hermes Harness”；任务复杂度只影响 Hermes 内部的规划和工具调用，不再决定是否切换到 Native。运行时事件必须记录实际 Runtime、状态和失败原因。</w:t>
       </w:r>
     </w:p>
     <w:p>
@@ -2919,7 +2919,7 @@
       </w:pPr>
       <w:r>
         <w:rPr>
-          <w:rFonts w:ascii="STSong" w:hAnsi="STSong" w:eastAsia="STSong" w:cs="STSong" w:hint="eastAsia"/>
+          <w:rFonts w:ascii="FangSong" w:hAnsi="FangSong" w:eastAsia="FangSong" w:cs="FangSong" w:hint="eastAsia"/>
           <w:b/>
           <w:i w:val="0"/>
           <w:color w:val="202020"/>
@@ -2974,7 +2974,7 @@
             </w:pPr>
             <w:r>
               <w:rPr>
-                <w:rFonts w:ascii="STSong" w:hAnsi="STSong" w:eastAsia="STSong" w:cs="STSong" w:hint="eastAsia"/>
+                <w:rFonts w:ascii="FangSong" w:hAnsi="FangSong" w:eastAsia="FangSong" w:cs="FangSong" w:hint="eastAsia"/>
                 <w:b/>
                 <w:i w:val="0"/>
                 <w:color w:val="FFFFFF"/>
@@ -3013,7 +3013,7 @@
             </w:pPr>
             <w:r>
               <w:rPr>
-                <w:rFonts w:ascii="STSong" w:hAnsi="STSong" w:eastAsia="STSong" w:cs="STSong" w:hint="eastAsia"/>
+                <w:rFonts w:ascii="FangSong" w:hAnsi="FangSong" w:eastAsia="FangSong" w:cs="FangSong" w:hint="eastAsia"/>
                 <w:b/>
                 <w:i w:val="0"/>
                 <w:color w:val="FFFFFF"/>
@@ -3052,7 +3052,7 @@
             </w:pPr>
             <w:r>
               <w:rPr>
-                <w:rFonts w:ascii="STSong" w:hAnsi="STSong" w:eastAsia="STSong" w:cs="STSong" w:hint="eastAsia"/>
+                <w:rFonts w:ascii="FangSong" w:hAnsi="FangSong" w:eastAsia="FangSong" w:cs="FangSong" w:hint="eastAsia"/>
                 <w:b/>
                 <w:i w:val="0"/>
                 <w:color w:val="FFFFFF"/>
@@ -3093,7 +3093,7 @@
             </w:pPr>
             <w:r>
               <w:rPr>
-                <w:rFonts w:ascii="STSong" w:hAnsi="STSong" w:eastAsia="STSong" w:cs="STSong" w:hint="eastAsia"/>
+                <w:rFonts w:ascii="FangSong" w:hAnsi="FangSong" w:eastAsia="FangSong" w:cs="FangSong" w:hint="eastAsia"/>
                 <w:b w:val="0"/>
                 <w:i w:val="0"/>
                 <w:color w:val="202020"/>
@@ -3132,14 +3132,14 @@
             </w:pPr>
             <w:r>
               <w:rPr>
-                <w:rFonts w:ascii="STSong" w:hAnsi="STSong" w:eastAsia="STSong" w:cs="STSong" w:hint="eastAsia"/>
+                <w:rFonts w:ascii="FangSong" w:hAnsi="FangSong" w:eastAsia="FangSong" w:cs="FangSong" w:hint="eastAsia"/>
                 <w:b w:val="0"/>
                 <w:i w:val="0"/>
                 <w:color w:val="202020"/>
                 <w:sz w:val="17"/>
                 <w:lang w:val="zh-CN" w:eastAsia="zh-CN" w:bidi="ar-SA"/>
               </w:rPr>
-              <w:t>Hermes ACP</w:t>
+              <w:t>内置 Hermes ACP</w:t>
             </w:r>
           </w:p>
         </w:tc>
@@ -3171,7 +3171,7 @@
             </w:pPr>
             <w:r>
               <w:rPr>
-                <w:rFonts w:ascii="STSong" w:hAnsi="STSong" w:eastAsia="STSong" w:cs="STSong" w:hint="eastAsia"/>
+                <w:rFonts w:ascii="FangSong" w:hAnsi="FangSong" w:eastAsia="FangSong" w:cs="FangSong" w:hint="eastAsia"/>
                 <w:b w:val="0"/>
                 <w:i w:val="0"/>
                 <w:color w:val="202020"/>
@@ -3213,7 +3213,7 @@
             </w:pPr>
             <w:r>
               <w:rPr>
-                <w:rFonts w:ascii="STSong" w:hAnsi="STSong" w:eastAsia="STSong" w:cs="STSong" w:hint="eastAsia"/>
+                <w:rFonts w:ascii="FangSong" w:hAnsi="FangSong" w:eastAsia="FangSong" w:cs="FangSong" w:hint="eastAsia"/>
                 <w:b w:val="0"/>
                 <w:i w:val="0"/>
                 <w:color w:val="202020"/>
@@ -3253,14 +3253,14 @@
             </w:pPr>
             <w:r>
               <w:rPr>
-                <w:rFonts w:ascii="STSong" w:hAnsi="STSong" w:eastAsia="STSong" w:cs="STSong" w:hint="eastAsia"/>
+                <w:rFonts w:ascii="FangSong" w:hAnsi="FangSong" w:eastAsia="FangSong" w:cs="FangSong" w:hint="eastAsia"/>
                 <w:b w:val="0"/>
                 <w:i w:val="0"/>
                 <w:color w:val="202020"/>
                 <w:sz w:val="17"/>
                 <w:lang w:val="zh-CN" w:eastAsia="zh-CN" w:bidi="ar-SA"/>
               </w:rPr>
-              <w:t>Hermes ACP</w:t>
+              <w:t>内置 Hermes ACP</w:t>
             </w:r>
           </w:p>
         </w:tc>
@@ -3293,14 +3293,14 @@
             </w:pPr>
             <w:r>
               <w:rPr>
-                <w:rFonts w:ascii="STSong" w:hAnsi="STSong" w:eastAsia="STSong" w:cs="STSong" w:hint="eastAsia"/>
+                <w:rFonts w:ascii="FangSong" w:hAnsi="FangSong" w:eastAsia="FangSong" w:cs="FangSong" w:hint="eastAsia"/>
                 <w:b w:val="0"/>
                 <w:i w:val="0"/>
                 <w:color w:val="202020"/>
                 <w:sz w:val="17"/>
                 <w:lang w:val="zh-CN" w:eastAsia="zh-CN" w:bidi="ar-SA"/>
               </w:rPr>
-              <w:t>适合 Hermes 的计划、试错和结果反馈；命令仍由 NeoWorker 执行</w:t>
+              <w:t>由 Hermes 规划和试错；命令仍由 NeoWorker 执行</w:t>
             </w:r>
           </w:p>
         </w:tc>
@@ -3334,7 +3334,7 @@
             </w:pPr>
             <w:r>
               <w:rPr>
-                <w:rFonts w:ascii="STSong" w:hAnsi="STSong" w:eastAsia="STSong" w:cs="STSong" w:hint="eastAsia"/>
+                <w:rFonts w:ascii="FangSong" w:hAnsi="FangSong" w:eastAsia="FangSong" w:cs="FangSong" w:hint="eastAsia"/>
                 <w:b w:val="0"/>
                 <w:i w:val="0"/>
                 <w:color w:val="202020"/>
@@ -3373,14 +3373,14 @@
             </w:pPr>
             <w:r>
               <w:rPr>
-                <w:rFonts w:ascii="STSong" w:hAnsi="STSong" w:eastAsia="STSong" w:cs="STSong" w:hint="eastAsia"/>
+                <w:rFonts w:ascii="FangSong" w:hAnsi="FangSong" w:eastAsia="FangSong" w:cs="FangSong" w:hint="eastAsia"/>
                 <w:b w:val="0"/>
                 <w:i w:val="0"/>
                 <w:color w:val="202020"/>
                 <w:sz w:val="17"/>
                 <w:lang w:val="zh-CN" w:eastAsia="zh-CN" w:bidi="ar-SA"/>
               </w:rPr>
-              <w:t>Hermes ACP</w:t>
+              <w:t>内置 Hermes ACP</w:t>
             </w:r>
           </w:p>
         </w:tc>
@@ -3412,14 +3412,14 @@
             </w:pPr>
             <w:r>
               <w:rPr>
-                <w:rFonts w:ascii="STSong" w:hAnsi="STSong" w:eastAsia="STSong" w:cs="STSong" w:hint="eastAsia"/>
+                <w:rFonts w:ascii="FangSong" w:hAnsi="FangSong" w:eastAsia="FangSong" w:cs="FangSong" w:hint="eastAsia"/>
                 <w:b w:val="0"/>
                 <w:i w:val="0"/>
                 <w:color w:val="202020"/>
                 <w:sz w:val="17"/>
                 <w:lang w:val="zh-CN" w:eastAsia="zh-CN" w:bidi="ar-SA"/>
               </w:rPr>
-              <w:t>适合先理解模板、再修改、再检查；必须增加产物完成门禁</w:t>
+              <w:t>先理解模板、再修改、再检查；必须增加产物完成门禁</w:t>
             </w:r>
           </w:p>
         </w:tc>
@@ -3454,7 +3454,7 @@
             </w:pPr>
             <w:r>
               <w:rPr>
-                <w:rFonts w:ascii="STSong" w:hAnsi="STSong" w:eastAsia="STSong" w:cs="STSong" w:hint="eastAsia"/>
+                <w:rFonts w:ascii="FangSong" w:hAnsi="FangSong" w:eastAsia="FangSong" w:cs="FangSong" w:hint="eastAsia"/>
                 <w:b w:val="0"/>
                 <w:i w:val="0"/>
                 <w:color w:val="202020"/>
@@ -3494,14 +3494,14 @@
             </w:pPr>
             <w:r>
               <w:rPr>
-                <w:rFonts w:ascii="STSong" w:hAnsi="STSong" w:eastAsia="STSong" w:cs="STSong" w:hint="eastAsia"/>
+                <w:rFonts w:ascii="FangSong" w:hAnsi="FangSong" w:eastAsia="FangSong" w:cs="FangSong" w:hint="eastAsia"/>
                 <w:b w:val="0"/>
                 <w:i w:val="0"/>
                 <w:color w:val="202020"/>
                 <w:sz w:val="17"/>
                 <w:lang w:val="zh-CN" w:eastAsia="zh-CN" w:bidi="ar-SA"/>
               </w:rPr>
-              <w:t>Native</w:t>
+              <w:t>内置 Hermes ACP</w:t>
             </w:r>
           </w:p>
         </w:tc>
@@ -3534,14 +3534,14 @@
             </w:pPr>
             <w:r>
               <w:rPr>
-                <w:rFonts w:ascii="STSong" w:hAnsi="STSong" w:eastAsia="STSong" w:cs="STSong" w:hint="eastAsia"/>
+                <w:rFonts w:ascii="FangSong" w:hAnsi="FangSong" w:eastAsia="FangSong" w:cs="FangSong" w:hint="eastAsia"/>
                 <w:b w:val="0"/>
                 <w:i w:val="0"/>
                 <w:color w:val="202020"/>
                 <w:sz w:val="17"/>
                 <w:lang w:val="zh-CN" w:eastAsia="zh-CN" w:bidi="ar-SA"/>
               </w:rPr>
-              <w:t>减少启动开销，避免把简单请求送入长 Agent Loop</w:t>
+              <w:t>保持统一任务语义，不再为省启动开销切换 Native</w:t>
             </w:r>
           </w:p>
         </w:tc>
@@ -3575,7 +3575,7 @@
             </w:pPr>
             <w:r>
               <w:rPr>
-                <w:rFonts w:ascii="STSong" w:hAnsi="STSong" w:eastAsia="STSong" w:cs="STSong" w:hint="eastAsia"/>
+                <w:rFonts w:ascii="FangSong" w:hAnsi="FangSong" w:eastAsia="FangSong" w:cs="FangSong" w:hint="eastAsia"/>
                 <w:b w:val="0"/>
                 <w:i w:val="0"/>
                 <w:color w:val="202020"/>
@@ -3614,14 +3614,14 @@
             </w:pPr>
             <w:r>
               <w:rPr>
-                <w:rFonts w:ascii="STSong" w:hAnsi="STSong" w:eastAsia="STSong" w:cs="STSong" w:hint="eastAsia"/>
+                <w:rFonts w:ascii="FangSong" w:hAnsi="FangSong" w:eastAsia="FangSong" w:cs="FangSong" w:hint="eastAsia"/>
                 <w:b w:val="0"/>
                 <w:i w:val="0"/>
                 <w:color w:val="202020"/>
                 <w:sz w:val="17"/>
                 <w:lang w:val="zh-CN" w:eastAsia="zh-CN" w:bidi="ar-SA"/>
               </w:rPr>
-              <w:t>Native 或 Auto</w:t>
+              <w:t>内置 Hermes ACP</w:t>
             </w:r>
           </w:p>
         </w:tc>
@@ -3653,14 +3653,14 @@
             </w:pPr>
             <w:r>
               <w:rPr>
-                <w:rFonts w:ascii="STSong" w:hAnsi="STSong" w:eastAsia="STSong" w:cs="STSong" w:hint="eastAsia"/>
+                <w:rFonts w:ascii="FangSong" w:hAnsi="FangSong" w:eastAsia="FangSong" w:cs="FangSong" w:hint="eastAsia"/>
                 <w:b w:val="0"/>
                 <w:i w:val="0"/>
                 <w:color w:val="202020"/>
                 <w:sz w:val="17"/>
                 <w:lang w:val="zh-CN" w:eastAsia="zh-CN" w:bidi="ar-SA"/>
               </w:rPr>
-              <w:t>由响应时间和审批策略决定</w:t>
+              <w:t>仍由统一 Harness 承接，便于审计、会话和结果收口</w:t>
             </w:r>
           </w:p>
         </w:tc>
@@ -3695,7 +3695,7 @@
             </w:pPr>
             <w:r>
               <w:rPr>
-                <w:rFonts w:ascii="STSong" w:hAnsi="STSong" w:eastAsia="STSong" w:cs="STSong" w:hint="eastAsia"/>
+                <w:rFonts w:ascii="FangSong" w:hAnsi="FangSong" w:eastAsia="FangSong" w:cs="FangSong" w:hint="eastAsia"/>
                 <w:b w:val="0"/>
                 <w:i w:val="0"/>
                 <w:color w:val="202020"/>
@@ -3735,14 +3735,14 @@
             </w:pPr>
             <w:r>
               <w:rPr>
-                <w:rFonts w:ascii="STSong" w:hAnsi="STSong" w:eastAsia="STSong" w:cs="STSong" w:hint="eastAsia"/>
+                <w:rFonts w:ascii="FangSong" w:hAnsi="FangSong" w:eastAsia="FangSong" w:cs="FangSong" w:hint="eastAsia"/>
                 <w:b w:val="0"/>
                 <w:i w:val="0"/>
                 <w:color w:val="202020"/>
                 <w:sz w:val="17"/>
                 <w:lang w:val="zh-CN" w:eastAsia="zh-CN" w:bidi="ar-SA"/>
               </w:rPr>
-              <w:t>先进入试验区</w:t>
+              <w:t>内置 Hermes ACP + 能力评估</w:t>
             </w:r>
           </w:p>
         </w:tc>
@@ -3775,14 +3775,14 @@
             </w:pPr>
             <w:r>
               <w:rPr>
-                <w:rFonts w:ascii="STSong" w:hAnsi="STSong" w:eastAsia="STSong" w:cs="STSong" w:hint="eastAsia"/>
+                <w:rFonts w:ascii="FangSong" w:hAnsi="FangSong" w:eastAsia="FangSong" w:cs="FangSong" w:hint="eastAsia"/>
                 <w:b w:val="0"/>
                 <w:i w:val="0"/>
                 <w:color w:val="202020"/>
                 <w:sz w:val="17"/>
                 <w:lang w:val="zh-CN" w:eastAsia="zh-CN" w:bidi="ar-SA"/>
               </w:rPr>
-              <w:t>当前宿主包装器会关闭这些能力，需先完成能力映射和所有权评估</w:t>
+              <w:t>当前宿主包装器保持受控能力范围，需先完成能力映射和所有权评估</w:t>
             </w:r>
           </w:p>
         </w:tc>
@@ -3801,7 +3801,7 @@
       </w:pPr>
       <w:r>
         <w:rPr>
-          <w:rFonts w:ascii="STSong" w:hAnsi="STSong" w:eastAsia="STSong" w:cs="STSong" w:hint="eastAsia"/>
+          <w:rFonts w:ascii="FangSong" w:hAnsi="FangSong" w:eastAsia="FangSong" w:cs="FangSong" w:hint="eastAsia"/>
           <w:b w:val="0"/>
           <w:i w:val="0"/>
           <w:color w:val="202020"/>
@@ -3819,7 +3819,7 @@
       </w:pPr>
       <w:r>
         <w:rPr>
-          <w:rFonts w:ascii="STSong" w:hAnsi="STSong" w:eastAsia="STSong" w:cs="STSong" w:hint="eastAsia"/>
+          <w:rFonts w:ascii="FangSong" w:hAnsi="FangSong" w:eastAsia="FangSong" w:cs="FangSong" w:hint="eastAsia"/>
           <w:b/>
           <w:i w:val="0"/>
           <w:color w:val="202020"/>
@@ -3837,7 +3837,7 @@
       </w:pPr>
       <w:r>
         <w:rPr>
-          <w:rFonts w:ascii="STSong" w:hAnsi="STSong" w:eastAsia="STSong" w:cs="STSong" w:hint="eastAsia"/>
+          <w:rFonts w:ascii="FangSong" w:hAnsi="FangSong" w:eastAsia="FangSong" w:cs="FangSong" w:hint="eastAsia"/>
           <w:b w:val="0"/>
           <w:i w:val="0"/>
           <w:color w:val="202020"/>
@@ -3855,7 +3855,7 @@
       </w:pPr>
       <w:r>
         <w:rPr>
-          <w:rFonts w:ascii="STSong" w:hAnsi="STSong" w:eastAsia="STSong" w:cs="STSong" w:hint="eastAsia"/>
+          <w:rFonts w:ascii="FangSong" w:hAnsi="FangSong" w:eastAsia="FangSong" w:cs="FangSong" w:hint="eastAsia"/>
           <w:b/>
           <w:i w:val="0"/>
           <w:color w:val="202020"/>
@@ -3873,7 +3873,7 @@
       </w:pPr>
       <w:r>
         <w:rPr>
-          <w:rFonts w:ascii="STSong" w:hAnsi="STSong" w:eastAsia="STSong" w:cs="STSong" w:hint="eastAsia"/>
+          <w:rFonts w:ascii="FangSong" w:hAnsi="FangSong" w:eastAsia="FangSong" w:cs="FangSong" w:hint="eastAsia"/>
           <w:b w:val="0"/>
           <w:i w:val="0"/>
           <w:color w:val="202020"/>
@@ -3892,14 +3892,14 @@
       </w:pPr>
       <w:r>
         <w:rPr>
-          <w:rFonts w:ascii="STSong" w:hAnsi="STSong" w:eastAsia="STSong" w:cs="STSong" w:hint="eastAsia"/>
+          <w:rFonts w:ascii="FangSong" w:hAnsi="FangSong" w:eastAsia="FangSong" w:cs="FangSong" w:hint="eastAsia"/>
           <w:b w:val="0"/>
           <w:i w:val="0"/>
           <w:color w:val="202020"/>
           <w:sz w:val="21"/>
           <w:lang w:val="zh-CN" w:eastAsia="zh-CN" w:bidi="ar-SA"/>
         </w:rPr>
-        <w:t>在任务设置或新建任务界面提供 Auto、Hermes、Native 三种模式，并把选择写入任务配置。</w:t>
+        <w:t>新任务由后端统一绑定内置 Hermes ACP 配置；前端不再展示或提交 Auto、Hermes、Native 运行时选择。</w:t>
       </w:r>
     </w:p>
     <w:p>
@@ -3911,14 +3911,14 @@
       </w:pPr>
       <w:r>
         <w:rPr>
-          <w:rFonts w:ascii="STSong" w:hAnsi="STSong" w:eastAsia="STSong" w:cs="STSong" w:hint="eastAsia"/>
+          <w:rFonts w:ascii="FangSong" w:hAnsi="FangSong" w:eastAsia="FangSong" w:cs="FangSong" w:hint="eastAsia"/>
           <w:b w:val="0"/>
           <w:i w:val="0"/>
           <w:color w:val="202020"/>
           <w:sz w:val="21"/>
           <w:lang w:val="zh-CN" w:eastAsia="zh-CN" w:bidi="ar-SA"/>
         </w:rPr>
-        <w:t>时间线显示 Hermes Active、Native Active、Fallback 和 Failed 等明确状态；记录 external runtime、Hermes 版本和宿主工具模式。</w:t>
+        <w:t>时间线显示实际 Hermes、历史 Native、失败和历史回退状态；记录 external runtime、Hermes 版本和宿主工具模式。</w:t>
       </w:r>
     </w:p>
     <w:p>
@@ -3930,14 +3930,14 @@
       </w:pPr>
       <w:r>
         <w:rPr>
-          <w:rFonts w:ascii="STSong" w:hAnsi="STSong" w:eastAsia="STSong" w:cs="STSong" w:hint="eastAsia"/>
+          <w:rFonts w:ascii="FangSong" w:hAnsi="FangSong" w:eastAsia="FangSong" w:cs="FangSong" w:hint="eastAsia"/>
           <w:b w:val="0"/>
           <w:i w:val="0"/>
           <w:color w:val="202020"/>
           <w:sz w:val="21"/>
           <w:lang w:val="zh-CN" w:eastAsia="zh-CN" w:bidi="ar-SA"/>
         </w:rPr>
-        <w:t>Hermes 模式启动失败时不静默切换到 Native。Auto 模式可以降级，但必须记录触发原因和是否已经发生工具副作用。</w:t>
+        <w:t>内置 Hermes 启动失败或执行失败时直接结束为失败，不静默切换到 Native；错误信息明确说明无需额外安装 Hermes Agent。</w:t>
       </w:r>
     </w:p>
     <w:p>
@@ -3949,7 +3949,7 @@
       </w:pPr>
       <w:r>
         <w:rPr>
-          <w:rFonts w:ascii="STSong" w:hAnsi="STSong" w:eastAsia="STSong" w:cs="STSong" w:hint="eastAsia"/>
+          <w:rFonts w:ascii="FangSong" w:hAnsi="FangSong" w:eastAsia="FangSong" w:cs="FangSong" w:hint="eastAsia"/>
           <w:b w:val="0"/>
           <w:i w:val="0"/>
           <w:color w:val="202020"/>
@@ -3967,7 +3967,7 @@
       </w:pPr>
       <w:r>
         <w:rPr>
-          <w:rFonts w:ascii="STSong" w:hAnsi="STSong" w:eastAsia="STSong" w:cs="STSong" w:hint="eastAsia"/>
+          <w:rFonts w:ascii="FangSong" w:hAnsi="FangSong" w:eastAsia="FangSong" w:cs="FangSong" w:hint="eastAsia"/>
           <w:b/>
           <w:i w:val="0"/>
           <w:color w:val="202020"/>
@@ -3978,14 +3978,14 @@
       </w:r>
       <w:r>
         <w:rPr>
-          <w:rFonts w:ascii="STSong" w:hAnsi="STSong" w:eastAsia="STSong" w:cs="STSong" w:hint="eastAsia"/>
+          <w:rFonts w:ascii="FangSong" w:hAnsi="FangSong" w:eastAsia="FangSong" w:cs="FangSong" w:hint="eastAsia"/>
           <w:b w:val="0"/>
           <w:i w:val="0"/>
           <w:color w:val="202020"/>
           <w:sz w:val="21"/>
           <w:lang w:val="zh-CN" w:eastAsia="zh-CN" w:bidi="ar-SA"/>
         </w:rPr>
-        <w:t>用户可以从任务记录中确认实际 Runtime；强制 Hermes 任务不会被误标为 Native；失败和降级可追溯。</w:t>
+        <w:t>用户可以从任务记录中确认实际 Runtime；新任务不会被误标为 Native；内置 Hermes 的失败和历史回退可追溯。</w:t>
       </w:r>
     </w:p>
     <w:p>
@@ -3996,14 +3996,14 @@
       </w:pPr>
       <w:r>
         <w:rPr>
-          <w:rFonts w:ascii="STSong" w:hAnsi="STSong" w:eastAsia="STSong" w:cs="STSong" w:hint="eastAsia"/>
+          <w:rFonts w:ascii="FangSong" w:hAnsi="FangSong" w:eastAsia="FangSong" w:cs="FangSong" w:hint="eastAsia"/>
           <w:b/>
           <w:i w:val="0"/>
           <w:color w:val="202020"/>
           <w:sz w:val="23"/>
           <w:lang w:val="zh-CN" w:eastAsia="zh-CN" w:bidi="ar-SA"/>
         </w:rPr>
-        <w:t>阶段 1 让复杂任务默认进入 Hermes</w:t>
+        <w:t>阶段 1 固定新任务进入内置 Hermes</w:t>
       </w:r>
     </w:p>
     <w:p>
@@ -4014,14 +4014,14 @@
       </w:pPr>
       <w:r>
         <w:rPr>
-          <w:rFonts w:ascii="STSong" w:hAnsi="STSong" w:eastAsia="STSong" w:cs="STSong" w:hint="eastAsia"/>
+          <w:rFonts w:ascii="FangSong" w:hAnsi="FangSong" w:eastAsia="FangSong" w:cs="FangSong" w:hint="eastAsia"/>
           <w:b w:val="0"/>
           <w:i w:val="0"/>
           <w:color w:val="202020"/>
           <w:sz w:val="21"/>
           <w:lang w:val="zh-CN" w:eastAsia="zh-CN" w:bidi="ar-SA"/>
         </w:rPr>
-        <w:t>在不改变所有任务默认行为的前提下，先把 Hermes 用在最能体现差异的任务类型。</w:t>
+        <w:t>这一步已经完成：所有普通新任务统一使用随 NeoWorker 交付的 Hermes ACP Host，不需要额外部署 Hermes Agent。</w:t>
       </w:r>
     </w:p>
     <w:p>
@@ -4033,14 +4033,14 @@
       </w:pPr>
       <w:r>
         <w:rPr>
-          <w:rFonts w:ascii="STSong" w:hAnsi="STSong" w:eastAsia="STSong" w:cs="STSong" w:hint="eastAsia"/>
+          <w:rFonts w:ascii="FangSong" w:hAnsi="FangSong" w:eastAsia="FangSong" w:cs="FangSong" w:hint="eastAsia"/>
           <w:b w:val="0"/>
           <w:i w:val="0"/>
           <w:color w:val="202020"/>
           <w:sz w:val="21"/>
           <w:lang w:val="zh-CN" w:eastAsia="zh-CN" w:bidi="ar-SA"/>
         </w:rPr>
-        <w:t>建立最小路由器：多工具、网页研究、结构化采集、代码调试和多步 Office 任务进入 Hermes ACP。</w:t>
+        <w:t>任务创建、Renderer IPC 和 AgentDaemon 创建路径统一写入内置 Hermes external runtime。</w:t>
       </w:r>
     </w:p>
     <w:p>
@@ -4052,14 +4052,14 @@
       </w:pPr>
       <w:r>
         <w:rPr>
-          <w:rFonts w:ascii="STSong" w:hAnsi="STSong" w:eastAsia="STSong" w:cs="STSong" w:hint="eastAsia"/>
+          <w:rFonts w:ascii="FangSong" w:hAnsi="FangSong" w:eastAsia="FangSong" w:cs="FangSong" w:hint="eastAsia"/>
           <w:b w:val="0"/>
           <w:i w:val="0"/>
           <w:color w:val="202020"/>
           <w:sz w:val="21"/>
           <w:lang w:val="zh-CN" w:eastAsia="zh-CN" w:bidi="ar-SA"/>
         </w:rPr>
-        <w:t>保留 Native 作为简单任务的快速路径，避免所有短请求承担 ACP 启动和会话开销。</w:t>
+        <w:t>继续复用现有 Tool Host、审批、沙箱、checkpoint、暂停恢复、取消和日志链。</w:t>
       </w:r>
     </w:p>
     <w:p>
@@ -4071,7 +4071,26 @@
       </w:pPr>
       <w:r>
         <w:rPr>
-          <w:rFonts w:ascii="STSong" w:hAnsi="STSong" w:eastAsia="STSong" w:cs="STSong" w:hint="eastAsia"/>
+          <w:rFonts w:ascii="FangSong" w:hAnsi="FangSong" w:eastAsia="FangSong" w:cs="FangSong" w:hint="eastAsia"/>
+          <w:b w:val="0"/>
+          <w:i w:val="0"/>
+          <w:color w:val="202020"/>
+          <w:sz w:val="21"/>
+          <w:lang w:val="zh-CN" w:eastAsia="zh-CN" w:bidi="ar-SA"/>
+        </w:rPr>
+        <w:t>保留 Native 仅用于历史任务兼容和明确的内部保底语义，不作为新任务的自动降级目标。</w:t>
+      </w:r>
+    </w:p>
+    <w:p>
+      <w:pPr>
+        <w:pStyle w:val="ListBullet"/>
+        <w:keepLines/>
+        <w:spacing w:before="0" w:after="60" w:line="276" w:lineRule="auto"/>
+        <w:ind w:left="0" w:firstLine="0"/>
+      </w:pPr>
+      <w:r>
+        <w:rPr>
+          <w:rFonts w:ascii="FangSong" w:hAnsi="FangSong" w:eastAsia="FangSong" w:cs="FangSong" w:hint="eastAsia"/>
           <w:b w:val="0"/>
           <w:i w:val="0"/>
           <w:color w:val="202020"/>
@@ -4090,7 +4109,7 @@
       </w:pPr>
       <w:r>
         <w:rPr>
-          <w:rFonts w:ascii="STSong" w:hAnsi="STSong" w:eastAsia="STSong" w:cs="STSong" w:hint="eastAsia"/>
+          <w:rFonts w:ascii="FangSong" w:hAnsi="FangSong" w:eastAsia="FangSong" w:cs="FangSong" w:hint="eastAsia"/>
           <w:b w:val="0"/>
           <w:i w:val="0"/>
           <w:color w:val="202020"/>
@@ -4108,7 +4127,7 @@
       </w:pPr>
       <w:r>
         <w:rPr>
-          <w:rFonts w:ascii="STSong" w:hAnsi="STSong" w:eastAsia="STSong" w:cs="STSong" w:hint="eastAsia"/>
+          <w:rFonts w:ascii="FangSong" w:hAnsi="FangSong" w:eastAsia="FangSong" w:cs="FangSong" w:hint="eastAsia"/>
           <w:b/>
           <w:i w:val="0"/>
           <w:color w:val="202020"/>
@@ -4119,7 +4138,7 @@
       </w:r>
       <w:r>
         <w:rPr>
-          <w:rFonts w:ascii="STSong" w:hAnsi="STSong" w:eastAsia="STSong" w:cs="STSong" w:hint="eastAsia"/>
+          <w:rFonts w:ascii="FangSong" w:hAnsi="FangSong" w:eastAsia="FangSong" w:cs="FangSong" w:hint="eastAsia"/>
           <w:b w:val="0"/>
           <w:i w:val="0"/>
           <w:color w:val="202020"/>
@@ -4137,7 +4156,7 @@
       </w:pPr>
       <w:r>
         <w:rPr>
-          <w:rFonts w:ascii="STSong" w:hAnsi="STSong" w:eastAsia="STSong" w:cs="STSong" w:hint="eastAsia"/>
+          <w:rFonts w:ascii="FangSong" w:hAnsi="FangSong" w:eastAsia="FangSong" w:cs="FangSong" w:hint="eastAsia"/>
           <w:b/>
           <w:i w:val="0"/>
           <w:color w:val="202020"/>
@@ -4155,7 +4174,7 @@
       </w:pPr>
       <w:r>
         <w:rPr>
-          <w:rFonts w:ascii="STSong" w:hAnsi="STSong" w:eastAsia="STSong" w:cs="STSong" w:hint="eastAsia"/>
+          <w:rFonts w:ascii="FangSong" w:hAnsi="FangSong" w:eastAsia="FangSong" w:cs="FangSong" w:hint="eastAsia"/>
           <w:b w:val="0"/>
           <w:i w:val="0"/>
           <w:color w:val="202020"/>
@@ -4174,7 +4193,7 @@
       </w:pPr>
       <w:r>
         <w:rPr>
-          <w:rFonts w:ascii="STSong" w:hAnsi="STSong" w:eastAsia="STSong" w:cs="STSong" w:hint="eastAsia"/>
+          <w:rFonts w:ascii="FangSong" w:hAnsi="FangSong" w:eastAsia="FangSong" w:cs="FangSong" w:hint="eastAsia"/>
           <w:b w:val="0"/>
           <w:i w:val="0"/>
           <w:color w:val="202020"/>
@@ -4193,7 +4212,7 @@
       </w:pPr>
       <w:r>
         <w:rPr>
-          <w:rFonts w:ascii="STSong" w:hAnsi="STSong" w:eastAsia="STSong" w:cs="STSong" w:hint="eastAsia"/>
+          <w:rFonts w:ascii="FangSong" w:hAnsi="FangSong" w:eastAsia="FangSong" w:cs="FangSong" w:hint="eastAsia"/>
           <w:b w:val="0"/>
           <w:i w:val="0"/>
           <w:color w:val="202020"/>
@@ -4212,7 +4231,7 @@
       </w:pPr>
       <w:r>
         <w:rPr>
-          <w:rFonts w:ascii="STSong" w:hAnsi="STSong" w:eastAsia="STSong" w:cs="STSong" w:hint="eastAsia"/>
+          <w:rFonts w:ascii="FangSong" w:hAnsi="FangSong" w:eastAsia="FangSong" w:cs="FangSong" w:hint="eastAsia"/>
           <w:b w:val="0"/>
           <w:i w:val="0"/>
           <w:color w:val="202020"/>
@@ -4231,7 +4250,7 @@
       </w:pPr>
       <w:r>
         <w:rPr>
-          <w:rFonts w:ascii="STSong" w:hAnsi="STSong" w:eastAsia="STSong" w:cs="STSong" w:hint="eastAsia"/>
+          <w:rFonts w:ascii="FangSong" w:hAnsi="FangSong" w:eastAsia="FangSong" w:cs="FangSong" w:hint="eastAsia"/>
           <w:b w:val="0"/>
           <w:i w:val="0"/>
           <w:color w:val="202020"/>
@@ -4249,7 +4268,7 @@
       </w:pPr>
       <w:r>
         <w:rPr>
-          <w:rFonts w:ascii="STSong" w:hAnsi="STSong" w:eastAsia="STSong" w:cs="STSong" w:hint="eastAsia"/>
+          <w:rFonts w:ascii="FangSong" w:hAnsi="FangSong" w:eastAsia="FangSong" w:cs="FangSong" w:hint="eastAsia"/>
           <w:b/>
           <w:i w:val="0"/>
           <w:color w:val="202020"/>
@@ -4260,7 +4279,7 @@
       </w:r>
       <w:r>
         <w:rPr>
-          <w:rFonts w:ascii="STSong" w:hAnsi="STSong" w:eastAsia="STSong" w:cs="STSong" w:hint="eastAsia"/>
+          <w:rFonts w:ascii="FangSong" w:hAnsi="FangSong" w:eastAsia="FangSong" w:cs="FangSong" w:hint="eastAsia"/>
           <w:b w:val="0"/>
           <w:i w:val="0"/>
           <w:color w:val="202020"/>
@@ -4278,14 +4297,14 @@
       </w:pPr>
       <w:r>
         <w:rPr>
-          <w:rFonts w:ascii="STSong" w:hAnsi="STSong" w:eastAsia="STSong" w:cs="STSong" w:hint="eastAsia"/>
+          <w:rFonts w:ascii="FangSong" w:hAnsi="FangSong" w:eastAsia="FangSong" w:cs="FangSong" w:hint="eastAsia"/>
           <w:b/>
           <w:i w:val="0"/>
           <w:color w:val="202020"/>
           <w:sz w:val="23"/>
           <w:lang w:val="zh-CN" w:eastAsia="zh-CN" w:bidi="ar-SA"/>
         </w:rPr>
-        <w:t>阶段 3 扩大默认覆盖并优化体验</w:t>
+        <w:t>阶段 3 完善能力覆盖并优化体验</w:t>
       </w:r>
     </w:p>
     <w:p>
@@ -4296,14 +4315,14 @@
       </w:pPr>
       <w:r>
         <w:rPr>
-          <w:rFonts w:ascii="STSong" w:hAnsi="STSong" w:eastAsia="STSong" w:cs="STSong" w:hint="eastAsia"/>
+          <w:rFonts w:ascii="FangSong" w:hAnsi="FangSong" w:eastAsia="FangSong" w:cs="FangSong" w:hint="eastAsia"/>
           <w:b w:val="0"/>
           <w:i w:val="0"/>
           <w:color w:val="202020"/>
           <w:sz w:val="21"/>
           <w:lang w:val="zh-CN" w:eastAsia="zh-CN" w:bidi="ar-SA"/>
         </w:rPr>
-        <w:t>当路由和能力覆盖稳定后，再把 Hermes 从“复杂任务优先”扩大为更普遍的默认体验。</w:t>
+        <w:t>在统一 Harness 路径稳定后，继续补齐 Hermes 能力映射、结果收口和用户可理解性。</w:t>
       </w:r>
     </w:p>
     <w:p>
@@ -4315,14 +4334,14 @@
       </w:pPr>
       <w:r>
         <w:rPr>
-          <w:rFonts w:ascii="STSong" w:hAnsi="STSong" w:eastAsia="STSong" w:cs="STSong" w:hint="eastAsia"/>
+          <w:rFonts w:ascii="FangSong" w:hAnsi="FangSong" w:eastAsia="FangSong" w:cs="FangSong" w:hint="eastAsia"/>
           <w:b w:val="0"/>
           <w:i w:val="0"/>
           <w:color w:val="202020"/>
           <w:sz w:val="21"/>
           <w:lang w:val="zh-CN" w:eastAsia="zh-CN" w:bidi="ar-SA"/>
         </w:rPr>
-        <w:t>根据评测结果调整 Auto 路由，允许用户按任务类型或工作区设置偏好。</w:t>
+        <w:t>根据真实任务评测扩展 Hermes 的受控工具、上下文和 Office 产物校验能力。</w:t>
       </w:r>
     </w:p>
     <w:p>
@@ -4334,7 +4353,7 @@
       </w:pPr>
       <w:r>
         <w:rPr>
-          <w:rFonts w:ascii="STSong" w:hAnsi="STSong" w:eastAsia="STSong" w:cs="STSong" w:hint="eastAsia"/>
+          <w:rFonts w:ascii="FangSong" w:hAnsi="FangSong" w:eastAsia="FangSong" w:cs="FangSong" w:hint="eastAsia"/>
           <w:b w:val="0"/>
           <w:i w:val="0"/>
           <w:color w:val="202020"/>
@@ -4353,7 +4372,7 @@
       </w:pPr>
       <w:r>
         <w:rPr>
-          <w:rFonts w:ascii="STSong" w:hAnsi="STSong" w:eastAsia="STSong" w:cs="STSong" w:hint="eastAsia"/>
+          <w:rFonts w:ascii="FangSong" w:hAnsi="FangSong" w:eastAsia="FangSong" w:cs="FangSong" w:hint="eastAsia"/>
           <w:b w:val="0"/>
           <w:i w:val="0"/>
           <w:color w:val="202020"/>
@@ -4372,7 +4391,7 @@
       </w:pPr>
       <w:r>
         <w:rPr>
-          <w:rFonts w:ascii="STSong" w:hAnsi="STSong" w:eastAsia="STSong" w:cs="STSong" w:hint="eastAsia"/>
+          <w:rFonts w:ascii="FangSong" w:hAnsi="FangSong" w:eastAsia="FangSong" w:cs="FangSong" w:hint="eastAsia"/>
           <w:b w:val="0"/>
           <w:i w:val="0"/>
           <w:color w:val="202020"/>
@@ -4390,7 +4409,7 @@
       </w:pPr>
       <w:r>
         <w:rPr>
-          <w:rFonts w:ascii="STSong" w:hAnsi="STSong" w:eastAsia="STSong" w:cs="STSong" w:hint="eastAsia"/>
+          <w:rFonts w:ascii="FangSong" w:hAnsi="FangSong" w:eastAsia="FangSong" w:cs="FangSong" w:hint="eastAsia"/>
           <w:b/>
           <w:i w:val="0"/>
           <w:color w:val="202020"/>
@@ -4401,14 +4420,14 @@
       </w:r>
       <w:r>
         <w:rPr>
-          <w:rFonts w:ascii="STSong" w:hAnsi="STSong" w:eastAsia="STSong" w:cs="STSong" w:hint="eastAsia"/>
+          <w:rFonts w:ascii="FangSong" w:hAnsi="FangSong" w:eastAsia="FangSong" w:cs="FangSong" w:hint="eastAsia"/>
           <w:b w:val="0"/>
           <w:i w:val="0"/>
           <w:color w:val="202020"/>
           <w:sz w:val="21"/>
           <w:lang w:val="zh-CN" w:eastAsia="zh-CN" w:bidi="ar-SA"/>
         </w:rPr>
-        <w:t>Hermes 成为复杂 Agent 任务的稳定默认路径，Native 仍能处理简单和特殊场景，用户能清楚理解两者差异。</w:t>
+        <w:t>新任务稳定经过内置 Hermes Harness，Native 兼容路径不影响新任务，用户能在时间线中看懂实际状态和失败原因。</w:t>
       </w:r>
     </w:p>
     <w:p>
@@ -4419,7 +4438,7 @@
       </w:pPr>
       <w:r>
         <w:rPr>
-          <w:rFonts w:ascii="STSong" w:hAnsi="STSong" w:eastAsia="STSong" w:cs="STSong" w:hint="eastAsia"/>
+          <w:rFonts w:ascii="FangSong" w:hAnsi="FangSong" w:eastAsia="FangSong" w:cs="FangSong" w:hint="eastAsia"/>
           <w:b/>
           <w:i w:val="0"/>
           <w:color w:val="202020"/>
@@ -4437,7 +4456,7 @@
       </w:pPr>
       <w:r>
         <w:rPr>
-          <w:rFonts w:ascii="STSong" w:hAnsi="STSong" w:eastAsia="STSong" w:cs="STSong" w:hint="eastAsia"/>
+          <w:rFonts w:ascii="FangSong" w:hAnsi="FangSong" w:eastAsia="FangSong" w:cs="FangSong" w:hint="eastAsia"/>
           <w:b w:val="0"/>
           <w:i w:val="0"/>
           <w:color w:val="202020"/>
@@ -4492,7 +4511,7 @@
             </w:pPr>
             <w:r>
               <w:rPr>
-                <w:rFonts w:ascii="STSong" w:hAnsi="STSong" w:eastAsia="STSong" w:cs="STSong" w:hint="eastAsia"/>
+                <w:rFonts w:ascii="FangSong" w:hAnsi="FangSong" w:eastAsia="FangSong" w:cs="FangSong" w:hint="eastAsia"/>
                 <w:b/>
                 <w:i w:val="0"/>
                 <w:color w:val="FFFFFF"/>
@@ -4531,7 +4550,7 @@
             </w:pPr>
             <w:r>
               <w:rPr>
-                <w:rFonts w:ascii="STSong" w:hAnsi="STSong" w:eastAsia="STSong" w:cs="STSong" w:hint="eastAsia"/>
+                <w:rFonts w:ascii="FangSong" w:hAnsi="FangSong" w:eastAsia="FangSong" w:cs="FangSong" w:hint="eastAsia"/>
                 <w:b/>
                 <w:i w:val="0"/>
                 <w:color w:val="FFFFFF"/>
@@ -4570,7 +4589,7 @@
             </w:pPr>
             <w:r>
               <w:rPr>
-                <w:rFonts w:ascii="STSong" w:hAnsi="STSong" w:eastAsia="STSong" w:cs="STSong" w:hint="eastAsia"/>
+                <w:rFonts w:ascii="FangSong" w:hAnsi="FangSong" w:eastAsia="FangSong" w:cs="FangSong" w:hint="eastAsia"/>
                 <w:b/>
                 <w:i w:val="0"/>
                 <w:color w:val="FFFFFF"/>
@@ -4611,7 +4630,7 @@
             </w:pPr>
             <w:r>
               <w:rPr>
-                <w:rFonts w:ascii="STSong" w:hAnsi="STSong" w:eastAsia="STSong" w:cs="STSong" w:hint="eastAsia"/>
+                <w:rFonts w:ascii="FangSong" w:hAnsi="FangSong" w:eastAsia="FangSong" w:cs="FangSong" w:hint="eastAsia"/>
                 <w:b w:val="0"/>
                 <w:i w:val="0"/>
                 <w:color w:val="202020"/>
@@ -4650,7 +4669,7 @@
             </w:pPr>
             <w:r>
               <w:rPr>
-                <w:rFonts w:ascii="STSong" w:hAnsi="STSong" w:eastAsia="STSong" w:cs="STSong" w:hint="eastAsia"/>
+                <w:rFonts w:ascii="FangSong" w:hAnsi="FangSong" w:eastAsia="FangSong" w:cs="FangSong" w:hint="eastAsia"/>
                 <w:b w:val="0"/>
                 <w:i w:val="0"/>
                 <w:color w:val="202020"/>
@@ -4689,14 +4708,14 @@
             </w:pPr>
             <w:r>
               <w:rPr>
-                <w:rFonts w:ascii="STSong" w:hAnsi="STSong" w:eastAsia="STSong" w:cs="STSong" w:hint="eastAsia"/>
+                <w:rFonts w:ascii="FangSong" w:hAnsi="FangSong" w:eastAsia="FangSong" w:cs="FangSong" w:hint="eastAsia"/>
                 <w:b w:val="0"/>
                 <w:i w:val="0"/>
                 <w:color w:val="202020"/>
                 <w:sz w:val="17"/>
                 <w:lang w:val="zh-CN" w:eastAsia="zh-CN" w:bidi="ar-SA"/>
               </w:rPr>
-              <w:t>强制 Hermes 无法被静默替换</w:t>
+              <w:t>新任务无法被静默替换为 Native</w:t>
             </w:r>
           </w:p>
         </w:tc>
@@ -4731,7 +4750,7 @@
             </w:pPr>
             <w:r>
               <w:rPr>
-                <w:rFonts w:ascii="STSong" w:hAnsi="STSong" w:eastAsia="STSong" w:cs="STSong" w:hint="eastAsia"/>
+                <w:rFonts w:ascii="FangSong" w:hAnsi="FangSong" w:eastAsia="FangSong" w:cs="FangSong" w:hint="eastAsia"/>
                 <w:b w:val="0"/>
                 <w:i w:val="0"/>
                 <w:color w:val="202020"/>
@@ -4771,7 +4790,7 @@
             </w:pPr>
             <w:r>
               <w:rPr>
-                <w:rFonts w:ascii="STSong" w:hAnsi="STSong" w:eastAsia="STSong" w:cs="STSong" w:hint="eastAsia"/>
+                <w:rFonts w:ascii="FangSong" w:hAnsi="FangSong" w:eastAsia="FangSong" w:cs="FangSong" w:hint="eastAsia"/>
                 <w:b w:val="0"/>
                 <w:i w:val="0"/>
                 <w:color w:val="202020"/>
@@ -4811,7 +4830,7 @@
             </w:pPr>
             <w:r>
               <w:rPr>
-                <w:rFonts w:ascii="STSong" w:hAnsi="STSong" w:eastAsia="STSong" w:cs="STSong" w:hint="eastAsia"/>
+                <w:rFonts w:ascii="FangSong" w:hAnsi="FangSong" w:eastAsia="FangSong" w:cs="FangSong" w:hint="eastAsia"/>
                 <w:b w:val="0"/>
                 <w:i w:val="0"/>
                 <w:color w:val="202020"/>
@@ -4852,7 +4871,7 @@
             </w:pPr>
             <w:r>
               <w:rPr>
-                <w:rFonts w:ascii="STSong" w:hAnsi="STSong" w:eastAsia="STSong" w:cs="STSong" w:hint="eastAsia"/>
+                <w:rFonts w:ascii="FangSong" w:hAnsi="FangSong" w:eastAsia="FangSong" w:cs="FangSong" w:hint="eastAsia"/>
                 <w:b w:val="0"/>
                 <w:i w:val="0"/>
                 <w:color w:val="202020"/>
@@ -4891,7 +4910,7 @@
             </w:pPr>
             <w:r>
               <w:rPr>
-                <w:rFonts w:ascii="STSong" w:hAnsi="STSong" w:eastAsia="STSong" w:cs="STSong" w:hint="eastAsia"/>
+                <w:rFonts w:ascii="FangSong" w:hAnsi="FangSong" w:eastAsia="FangSong" w:cs="FangSong" w:hint="eastAsia"/>
                 <w:b w:val="0"/>
                 <w:i w:val="0"/>
                 <w:color w:val="202020"/>
@@ -4930,7 +4949,7 @@
             </w:pPr>
             <w:r>
               <w:rPr>
-                <w:rFonts w:ascii="STSong" w:hAnsi="STSong" w:eastAsia="STSong" w:cs="STSong" w:hint="eastAsia"/>
+                <w:rFonts w:ascii="FangSong" w:hAnsi="FangSong" w:eastAsia="FangSong" w:cs="FangSong" w:hint="eastAsia"/>
                 <w:b w:val="0"/>
                 <w:i w:val="0"/>
                 <w:color w:val="202020"/>
@@ -4972,7 +4991,7 @@
             </w:pPr>
             <w:r>
               <w:rPr>
-                <w:rFonts w:ascii="STSong" w:hAnsi="STSong" w:eastAsia="STSong" w:cs="STSong" w:hint="eastAsia"/>
+                <w:rFonts w:ascii="FangSong" w:hAnsi="FangSong" w:eastAsia="FangSong" w:cs="FangSong" w:hint="eastAsia"/>
                 <w:b w:val="0"/>
                 <w:i w:val="0"/>
                 <w:color w:val="202020"/>
@@ -5012,7 +5031,7 @@
             </w:pPr>
             <w:r>
               <w:rPr>
-                <w:rFonts w:ascii="STSong" w:hAnsi="STSong" w:eastAsia="STSong" w:cs="STSong" w:hint="eastAsia"/>
+                <w:rFonts w:ascii="FangSong" w:hAnsi="FangSong" w:eastAsia="FangSong" w:cs="FangSong" w:hint="eastAsia"/>
                 <w:b w:val="0"/>
                 <w:i w:val="0"/>
                 <w:color w:val="202020"/>
@@ -5052,7 +5071,7 @@
             </w:pPr>
             <w:r>
               <w:rPr>
-                <w:rFonts w:ascii="STSong" w:hAnsi="STSong" w:eastAsia="STSong" w:cs="STSong" w:hint="eastAsia"/>
+                <w:rFonts w:ascii="FangSong" w:hAnsi="FangSong" w:eastAsia="FangSong" w:cs="FangSong" w:hint="eastAsia"/>
                 <w:b w:val="0"/>
                 <w:i w:val="0"/>
                 <w:color w:val="202020"/>
@@ -5093,7 +5112,7 @@
             </w:pPr>
             <w:r>
               <w:rPr>
-                <w:rFonts w:ascii="STSong" w:hAnsi="STSong" w:eastAsia="STSong" w:cs="STSong" w:hint="eastAsia"/>
+                <w:rFonts w:ascii="FangSong" w:hAnsi="FangSong" w:eastAsia="FangSong" w:cs="FangSong" w:hint="eastAsia"/>
                 <w:b w:val="0"/>
                 <w:i w:val="0"/>
                 <w:color w:val="202020"/>
@@ -5132,7 +5151,7 @@
             </w:pPr>
             <w:r>
               <w:rPr>
-                <w:rFonts w:ascii="STSong" w:hAnsi="STSong" w:eastAsia="STSong" w:cs="STSong" w:hint="eastAsia"/>
+                <w:rFonts w:ascii="FangSong" w:hAnsi="FangSong" w:eastAsia="FangSong" w:cs="FangSong" w:hint="eastAsia"/>
                 <w:b w:val="0"/>
                 <w:i w:val="0"/>
                 <w:color w:val="202020"/>
@@ -5171,7 +5190,7 @@
             </w:pPr>
             <w:r>
               <w:rPr>
-                <w:rFonts w:ascii="STSong" w:hAnsi="STSong" w:eastAsia="STSong" w:cs="STSong" w:hint="eastAsia"/>
+                <w:rFonts w:ascii="FangSong" w:hAnsi="FangSong" w:eastAsia="FangSong" w:cs="FangSong" w:hint="eastAsia"/>
                 <w:b w:val="0"/>
                 <w:i w:val="0"/>
                 <w:color w:val="202020"/>
@@ -5213,7 +5232,7 @@
             </w:pPr>
             <w:r>
               <w:rPr>
-                <w:rFonts w:ascii="STSong" w:hAnsi="STSong" w:eastAsia="STSong" w:cs="STSong" w:hint="eastAsia"/>
+                <w:rFonts w:ascii="FangSong" w:hAnsi="FangSong" w:eastAsia="FangSong" w:cs="FangSong" w:hint="eastAsia"/>
                 <w:b w:val="0"/>
                 <w:i w:val="0"/>
                 <w:color w:val="202020"/>
@@ -5253,7 +5272,7 @@
             </w:pPr>
             <w:r>
               <w:rPr>
-                <w:rFonts w:ascii="STSong" w:hAnsi="STSong" w:eastAsia="STSong" w:cs="STSong" w:hint="eastAsia"/>
+                <w:rFonts w:ascii="FangSong" w:hAnsi="FangSong" w:eastAsia="FangSong" w:cs="FangSong" w:hint="eastAsia"/>
                 <w:b w:val="0"/>
                 <w:i w:val="0"/>
                 <w:color w:val="202020"/>
@@ -5293,7 +5312,7 @@
             </w:pPr>
             <w:r>
               <w:rPr>
-                <w:rFonts w:ascii="STSong" w:hAnsi="STSong" w:eastAsia="STSong" w:cs="STSong" w:hint="eastAsia"/>
+                <w:rFonts w:ascii="FangSong" w:hAnsi="FangSong" w:eastAsia="FangSong" w:cs="FangSong" w:hint="eastAsia"/>
                 <w:b w:val="0"/>
                 <w:i w:val="0"/>
                 <w:color w:val="202020"/>
@@ -5319,7 +5338,7 @@
       </w:pPr>
       <w:r>
         <w:rPr>
-          <w:rFonts w:ascii="STSong" w:hAnsi="STSong" w:eastAsia="STSong" w:cs="STSong" w:hint="eastAsia"/>
+          <w:rFonts w:ascii="FangSong" w:hAnsi="FangSong" w:eastAsia="FangSong" w:cs="FangSong" w:hint="eastAsia"/>
           <w:b/>
           <w:i w:val="0"/>
           <w:color w:val="202020"/>
@@ -5330,7 +5349,7 @@
       </w:r>
       <w:r>
         <w:rPr>
-          <w:rFonts w:ascii="STSong" w:hAnsi="STSong" w:eastAsia="STSong" w:cs="STSong" w:hint="eastAsia"/>
+          <w:rFonts w:ascii="FangSong" w:hAnsi="FangSong" w:eastAsia="FangSong" w:cs="FangSong" w:hint="eastAsia"/>
           <w:b w:val="0"/>
           <w:i w:val="0"/>
           <w:color w:val="202020"/>
@@ -5348,7 +5367,7 @@
       </w:pPr>
       <w:r>
         <w:rPr>
-          <w:rFonts w:ascii="STSong" w:hAnsi="STSong" w:eastAsia="STSong" w:cs="STSong" w:hint="eastAsia"/>
+          <w:rFonts w:ascii="FangSong" w:hAnsi="FangSong" w:eastAsia="FangSong" w:cs="FangSong" w:hint="eastAsia"/>
           <w:b/>
           <w:i w:val="0"/>
           <w:color w:val="202020"/>
@@ -5403,7 +5422,7 @@
             </w:pPr>
             <w:r>
               <w:rPr>
-                <w:rFonts w:ascii="STSong" w:hAnsi="STSong" w:eastAsia="STSong" w:cs="STSong" w:hint="eastAsia"/>
+                <w:rFonts w:ascii="FangSong" w:hAnsi="FangSong" w:eastAsia="FangSong" w:cs="FangSong" w:hint="eastAsia"/>
                 <w:b/>
                 <w:i w:val="0"/>
                 <w:color w:val="FFFFFF"/>
@@ -5442,7 +5461,7 @@
             </w:pPr>
             <w:r>
               <w:rPr>
-                <w:rFonts w:ascii="STSong" w:hAnsi="STSong" w:eastAsia="STSong" w:cs="STSong" w:hint="eastAsia"/>
+                <w:rFonts w:ascii="FangSong" w:hAnsi="FangSong" w:eastAsia="FangSong" w:cs="FangSong" w:hint="eastAsia"/>
                 <w:b/>
                 <w:i w:val="0"/>
                 <w:color w:val="FFFFFF"/>
@@ -5481,7 +5500,7 @@
             </w:pPr>
             <w:r>
               <w:rPr>
-                <w:rFonts w:ascii="STSong" w:hAnsi="STSong" w:eastAsia="STSong" w:cs="STSong" w:hint="eastAsia"/>
+                <w:rFonts w:ascii="FangSong" w:hAnsi="FangSong" w:eastAsia="FangSong" w:cs="FangSong" w:hint="eastAsia"/>
                 <w:b/>
                 <w:i w:val="0"/>
                 <w:color w:val="FFFFFF"/>
@@ -5522,7 +5541,7 @@
             </w:pPr>
             <w:r>
               <w:rPr>
-                <w:rFonts w:ascii="STSong" w:hAnsi="STSong" w:eastAsia="STSong" w:cs="STSong" w:hint="eastAsia"/>
+                <w:rFonts w:ascii="FangSong" w:hAnsi="FangSong" w:eastAsia="FangSong" w:cs="FangSong" w:hint="eastAsia"/>
                 <w:b w:val="0"/>
                 <w:i w:val="0"/>
                 <w:color w:val="202020"/>
@@ -5561,7 +5580,7 @@
             </w:pPr>
             <w:r>
               <w:rPr>
-                <w:rFonts w:ascii="STSong" w:hAnsi="STSong" w:eastAsia="STSong" w:cs="STSong" w:hint="eastAsia"/>
+                <w:rFonts w:ascii="FangSong" w:hAnsi="FangSong" w:eastAsia="FangSong" w:cs="FangSong" w:hint="eastAsia"/>
                 <w:b w:val="0"/>
                 <w:i w:val="0"/>
                 <w:color w:val="202020"/>
@@ -5600,7 +5619,7 @@
             </w:pPr>
             <w:r>
               <w:rPr>
-                <w:rFonts w:ascii="STSong" w:hAnsi="STSong" w:eastAsia="STSong" w:cs="STSong" w:hint="eastAsia"/>
+                <w:rFonts w:ascii="FangSong" w:hAnsi="FangSong" w:eastAsia="FangSong" w:cs="FangSong" w:hint="eastAsia"/>
                 <w:b w:val="0"/>
                 <w:i w:val="0"/>
                 <w:color w:val="202020"/>
@@ -5642,7 +5661,7 @@
             </w:pPr>
             <w:r>
               <w:rPr>
-                <w:rFonts w:ascii="STSong" w:hAnsi="STSong" w:eastAsia="STSong" w:cs="STSong" w:hint="eastAsia"/>
+                <w:rFonts w:ascii="FangSong" w:hAnsi="FangSong" w:eastAsia="FangSong" w:cs="FangSong" w:hint="eastAsia"/>
                 <w:b w:val="0"/>
                 <w:i w:val="0"/>
                 <w:color w:val="202020"/>
@@ -5682,7 +5701,7 @@
             </w:pPr>
             <w:r>
               <w:rPr>
-                <w:rFonts w:ascii="STSong" w:hAnsi="STSong" w:eastAsia="STSong" w:cs="STSong" w:hint="eastAsia"/>
+                <w:rFonts w:ascii="FangSong" w:hAnsi="FangSong" w:eastAsia="FangSong" w:cs="FangSong" w:hint="eastAsia"/>
                 <w:b w:val="0"/>
                 <w:i w:val="0"/>
                 <w:color w:val="202020"/>
@@ -5722,14 +5741,14 @@
             </w:pPr>
             <w:r>
               <w:rPr>
-                <w:rFonts w:ascii="STSong" w:hAnsi="STSong" w:eastAsia="STSong" w:cs="STSong" w:hint="eastAsia"/>
+                <w:rFonts w:ascii="FangSong" w:hAnsi="FangSong" w:eastAsia="FangSong" w:cs="FangSong" w:hint="eastAsia"/>
                 <w:b w:val="0"/>
                 <w:i w:val="0"/>
                 <w:color w:val="202020"/>
                 <w:sz w:val="17"/>
                 <w:lang w:val="zh-CN" w:eastAsia="zh-CN" w:bidi="ar-SA"/>
               </w:rPr>
-              <w:t>运行模式持久化，时间线显示，强制模式禁止静默降级</w:t>
+              <w:t>运行时持久化，时间线显示，新任务禁止静默降级</w:t>
             </w:r>
           </w:p>
         </w:tc>
@@ -5763,7 +5782,7 @@
             </w:pPr>
             <w:r>
               <w:rPr>
-                <w:rFonts w:ascii="STSong" w:hAnsi="STSong" w:eastAsia="STSong" w:cs="STSong" w:hint="eastAsia"/>
+                <w:rFonts w:ascii="FangSong" w:hAnsi="FangSong" w:eastAsia="FangSong" w:cs="FangSong" w:hint="eastAsia"/>
                 <w:b w:val="0"/>
                 <w:i w:val="0"/>
                 <w:color w:val="202020"/>
@@ -5802,7 +5821,7 @@
             </w:pPr>
             <w:r>
               <w:rPr>
-                <w:rFonts w:ascii="STSong" w:hAnsi="STSong" w:eastAsia="STSong" w:cs="STSong" w:hint="eastAsia"/>
+                <w:rFonts w:ascii="FangSong" w:hAnsi="FangSong" w:eastAsia="FangSong" w:cs="FangSong" w:hint="eastAsia"/>
                 <w:b w:val="0"/>
                 <w:i w:val="0"/>
                 <w:color w:val="202020"/>
@@ -5841,7 +5860,7 @@
             </w:pPr>
             <w:r>
               <w:rPr>
-                <w:rFonts w:ascii="STSong" w:hAnsi="STSong" w:eastAsia="STSong" w:cs="STSong" w:hint="eastAsia"/>
+                <w:rFonts w:ascii="FangSong" w:hAnsi="FangSong" w:eastAsia="FangSong" w:cs="FangSong" w:hint="eastAsia"/>
                 <w:b w:val="0"/>
                 <w:i w:val="0"/>
                 <w:color w:val="202020"/>
@@ -5883,7 +5902,7 @@
             </w:pPr>
             <w:r>
               <w:rPr>
-                <w:rFonts w:ascii="STSong" w:hAnsi="STSong" w:eastAsia="STSong" w:cs="STSong" w:hint="eastAsia"/>
+                <w:rFonts w:ascii="FangSong" w:hAnsi="FangSong" w:eastAsia="FangSong" w:cs="FangSong" w:hint="eastAsia"/>
                 <w:b w:val="0"/>
                 <w:i w:val="0"/>
                 <w:color w:val="202020"/>
@@ -5923,7 +5942,7 @@
             </w:pPr>
             <w:r>
               <w:rPr>
-                <w:rFonts w:ascii="STSong" w:hAnsi="STSong" w:eastAsia="STSong" w:cs="STSong" w:hint="eastAsia"/>
+                <w:rFonts w:ascii="FangSong" w:hAnsi="FangSong" w:eastAsia="FangSong" w:cs="FangSong" w:hint="eastAsia"/>
                 <w:b w:val="0"/>
                 <w:i w:val="0"/>
                 <w:color w:val="202020"/>
@@ -5963,7 +5982,7 @@
             </w:pPr>
             <w:r>
               <w:rPr>
-                <w:rFonts w:ascii="STSong" w:hAnsi="STSong" w:eastAsia="STSong" w:cs="STSong" w:hint="eastAsia"/>
+                <w:rFonts w:ascii="FangSong" w:hAnsi="FangSong" w:eastAsia="FangSong" w:cs="FangSong" w:hint="eastAsia"/>
                 <w:b w:val="0"/>
                 <w:i w:val="0"/>
                 <w:color w:val="202020"/>
@@ -6004,7 +6023,7 @@
             </w:pPr>
             <w:r>
               <w:rPr>
-                <w:rFonts w:ascii="STSong" w:hAnsi="STSong" w:eastAsia="STSong" w:cs="STSong" w:hint="eastAsia"/>
+                <w:rFonts w:ascii="FangSong" w:hAnsi="FangSong" w:eastAsia="FangSong" w:cs="FangSong" w:hint="eastAsia"/>
                 <w:b w:val="0"/>
                 <w:i w:val="0"/>
                 <w:color w:val="202020"/>
@@ -6043,7 +6062,7 @@
             </w:pPr>
             <w:r>
               <w:rPr>
-                <w:rFonts w:ascii="STSong" w:hAnsi="STSong" w:eastAsia="STSong" w:cs="STSong" w:hint="eastAsia"/>
+                <w:rFonts w:ascii="FangSong" w:hAnsi="FangSong" w:eastAsia="FangSong" w:cs="FangSong" w:hint="eastAsia"/>
                 <w:b w:val="0"/>
                 <w:i w:val="0"/>
                 <w:color w:val="202020"/>
@@ -6082,7 +6101,7 @@
             </w:pPr>
             <w:r>
               <w:rPr>
-                <w:rFonts w:ascii="STSong" w:hAnsi="STSong" w:eastAsia="STSong" w:cs="STSong" w:hint="eastAsia"/>
+                <w:rFonts w:ascii="FangSong" w:hAnsi="FangSong" w:eastAsia="FangSong" w:cs="FangSong" w:hint="eastAsia"/>
                 <w:b w:val="0"/>
                 <w:i w:val="0"/>
                 <w:color w:val="202020"/>
@@ -6124,7 +6143,7 @@
             </w:pPr>
             <w:r>
               <w:rPr>
-                <w:rFonts w:ascii="STSong" w:hAnsi="STSong" w:eastAsia="STSong" w:cs="STSong" w:hint="eastAsia"/>
+                <w:rFonts w:ascii="FangSong" w:hAnsi="FangSong" w:eastAsia="FangSong" w:cs="FangSong" w:hint="eastAsia"/>
                 <w:b w:val="0"/>
                 <w:i w:val="0"/>
                 <w:color w:val="202020"/>
@@ -6164,7 +6183,7 @@
             </w:pPr>
             <w:r>
               <w:rPr>
-                <w:rFonts w:ascii="STSong" w:hAnsi="STSong" w:eastAsia="STSong" w:cs="STSong" w:hint="eastAsia"/>
+                <w:rFonts w:ascii="FangSong" w:hAnsi="FangSong" w:eastAsia="FangSong" w:cs="FangSong" w:hint="eastAsia"/>
                 <w:b w:val="0"/>
                 <w:i w:val="0"/>
                 <w:color w:val="202020"/>
@@ -6204,7 +6223,7 @@
             </w:pPr>
             <w:r>
               <w:rPr>
-                <w:rFonts w:ascii="STSong" w:hAnsi="STSong" w:eastAsia="STSong" w:cs="STSong" w:hint="eastAsia"/>
+                <w:rFonts w:ascii="FangSong" w:hAnsi="FangSong" w:eastAsia="FangSong" w:cs="FangSong" w:hint="eastAsia"/>
                 <w:b w:val="0"/>
                 <w:i w:val="0"/>
                 <w:color w:val="202020"/>
@@ -6230,7 +6249,7 @@
       </w:pPr>
       <w:r>
         <w:rPr>
-          <w:rFonts w:ascii="STSong" w:hAnsi="STSong" w:eastAsia="STSong" w:cs="STSong" w:hint="eastAsia"/>
+          <w:rFonts w:ascii="FangSong" w:hAnsi="FangSong" w:eastAsia="FangSong" w:cs="FangSong" w:hint="eastAsia"/>
           <w:b/>
           <w:i w:val="0"/>
           <w:color w:val="202020"/>
@@ -6249,14 +6268,14 @@
       </w:pPr>
       <w:r>
         <w:rPr>
-          <w:rFonts w:ascii="STSong" w:hAnsi="STSong" w:eastAsia="STSong" w:cs="STSong" w:hint="eastAsia"/>
+          <w:rFonts w:ascii="FangSong" w:hAnsi="FangSong" w:eastAsia="FangSong" w:cs="FangSong" w:hint="eastAsia"/>
           <w:b w:val="0"/>
           <w:i w:val="0"/>
           <w:color w:val="202020"/>
           <w:sz w:val="21"/>
           <w:lang w:val="zh-CN" w:eastAsia="zh-CN" w:bidi="ar-SA"/>
         </w:rPr>
-        <w:t>NeoWorker 的默认体验是 Auto 优先，还是对所有新任务默认启用 Hermes？建议先选择 Auto。</w:t>
+        <w:t>内置 Hermes Host 在不同机器和安装包形态下的启动成功率、耗时和资源占用是否满足发布门槛？</w:t>
       </w:r>
     </w:p>
     <w:p>
@@ -6268,26 +6287,7 @@
       </w:pPr>
       <w:r>
         <w:rPr>
-          <w:rFonts w:ascii="STSong" w:hAnsi="STSong" w:eastAsia="STSong" w:cs="STSong" w:hint="eastAsia"/>
-          <w:b w:val="0"/>
-          <w:i w:val="0"/>
-          <w:color w:val="202020"/>
-          <w:sz w:val="21"/>
-          <w:lang w:val="zh-CN" w:eastAsia="zh-CN" w:bidi="ar-SA"/>
-        </w:rPr>
-        <w:t>哪些任务需要用户强制使用 Hermes？建议至少包括复杂研究、网页采集、代码调试和多步 Office 任务。</w:t>
-      </w:r>
-    </w:p>
-    <w:p>
-      <w:pPr>
-        <w:pStyle w:val="ListNumber"/>
-        <w:keepLines/>
-        <w:spacing w:before="0" w:after="60" w:line="276" w:lineRule="auto"/>
-        <w:ind w:left="0" w:firstLine="0"/>
-      </w:pPr>
-      <w:r>
-        <w:rPr>
-          <w:rFonts w:ascii="STSong" w:hAnsi="STSong" w:eastAsia="STSong" w:cs="STSong" w:hint="eastAsia"/>
+          <w:rFonts w:ascii="FangSong" w:hAnsi="FangSong" w:eastAsia="FangSong" w:cs="FangSong" w:hint="eastAsia"/>
           <w:b w:val="0"/>
           <w:i w:val="0"/>
           <w:color w:val="202020"/>
@@ -6306,14 +6306,14 @@
       </w:pPr>
       <w:r>
         <w:rPr>
-          <w:rFonts w:ascii="STSong" w:hAnsi="STSong" w:eastAsia="STSong" w:cs="STSong" w:hint="eastAsia"/>
+          <w:rFonts w:ascii="FangSong" w:hAnsi="FangSong" w:eastAsia="FangSong" w:cs="FangSong" w:hint="eastAsia"/>
           <w:b w:val="0"/>
           <w:i w:val="0"/>
           <w:color w:val="202020"/>
           <w:sz w:val="21"/>
           <w:lang w:val="zh-CN" w:eastAsia="zh-CN" w:bidi="ar-SA"/>
         </w:rPr>
-        <w:t>Hermes 运行失败时，Auto 模式是否允许降级？允许降级的条件需要与“已经发生副作用”绑定。</w:t>
+        <w:t>历史 Native 任务和显式外部 ACP 任务的兼容边界是否需要进一步收紧？</w:t>
       </w:r>
     </w:p>
     <w:p>
@@ -6325,7 +6325,7 @@
       </w:pPr>
       <w:r>
         <w:rPr>
-          <w:rFonts w:ascii="STSong" w:hAnsi="STSong" w:eastAsia="STSong" w:cs="STSong" w:hint="eastAsia"/>
+          <w:rFonts w:ascii="FangSong" w:hAnsi="FangSong" w:eastAsia="FangSong" w:cs="FangSong" w:hint="eastAsia"/>
           <w:b w:val="0"/>
           <w:i w:val="0"/>
           <w:color w:val="202020"/>
@@ -6344,14 +6344,14 @@
       </w:pPr>
       <w:r>
         <w:rPr>
-          <w:rFonts w:ascii="STSong" w:hAnsi="STSong" w:eastAsia="STSong" w:cs="STSong" w:hint="eastAsia"/>
+          <w:rFonts w:ascii="FangSong" w:hAnsi="FangSong" w:eastAsia="FangSong" w:cs="FangSong" w:hint="eastAsia"/>
           <w:b w:val="0"/>
           <w:i w:val="0"/>
           <w:color w:val="202020"/>
           <w:sz w:val="21"/>
           <w:lang w:val="zh-CN" w:eastAsia="zh-CN" w:bidi="ar-SA"/>
         </w:rPr>
-        <w:t>是否把 Hermes 版本升级设为独立发布门禁？当前建议把 `hermes-agent==0.18.0` 作为明确的运行时依赖，升级必须重新验收。</w:t>
+        <w:t>是否把内置 Hermes Host 版本升级设为独立发布门禁？每次升级都必须重新验收 ACP、工具、恢复和安装包行为。</w:t>
       </w:r>
     </w:p>
     <w:p>
@@ -6362,7 +6362,7 @@
       </w:pPr>
       <w:r>
         <w:rPr>
-          <w:rFonts w:ascii="STSong" w:hAnsi="STSong" w:eastAsia="STSong" w:cs="STSong" w:hint="eastAsia"/>
+          <w:rFonts w:ascii="FangSong" w:hAnsi="FangSong" w:eastAsia="FangSong" w:cs="FangSong" w:hint="eastAsia"/>
           <w:b/>
           <w:i w:val="0"/>
           <w:color w:val="202020"/>
@@ -6380,14 +6380,14 @@
       </w:pPr>
       <w:r>
         <w:rPr>
-          <w:rFonts w:ascii="STSong" w:hAnsi="STSong" w:eastAsia="STSong" w:cs="STSong" w:hint="eastAsia"/>
+          <w:rFonts w:ascii="FangSong" w:hAnsi="FangSong" w:eastAsia="FangSong" w:cs="FangSong" w:hint="eastAsia"/>
           <w:b w:val="0"/>
           <w:i w:val="0"/>
           <w:color w:val="202020"/>
           <w:sz w:val="21"/>
           <w:lang w:val="zh-CN" w:eastAsia="zh-CN" w:bidi="ar-SA"/>
         </w:rPr>
-        <w:t>第一批工作不必扩大 Hermes 的能力边界，先把已经接通的能力变成用户可选择、系统可观察、失败可解释的产品路径。</w:t>
+        <w:t>第一批工作已经完成运行时统一和失败语义收口。后续工作不扩大副作用边界，重点是把内置 Hermes 的能力覆盖、结果质量和发布验证做扎实。</w:t>
       </w:r>
     </w:p>
     <w:p>
@@ -6399,14 +6399,14 @@
       </w:pPr>
       <w:r>
         <w:rPr>
-          <w:rFonts w:ascii="STSong" w:hAnsi="STSong" w:eastAsia="STSong" w:cs="STSong" w:hint="eastAsia"/>
+          <w:rFonts w:ascii="FangSong" w:hAnsi="FangSong" w:eastAsia="FangSong" w:cs="FangSong" w:hint="eastAsia"/>
           <w:b w:val="0"/>
           <w:i w:val="0"/>
           <w:color w:val="202020"/>
           <w:sz w:val="21"/>
           <w:lang w:val="zh-CN" w:eastAsia="zh-CN" w:bidi="ar-SA"/>
         </w:rPr>
-        <w:t>实现任务级 Runtime 选择和配置持久化。</w:t>
+        <w:t>新任务默认绑定内置 Hermes，前端隐藏运行时选择，后端保留旧字段仅用于兼容历史数据。</w:t>
       </w:r>
     </w:p>
     <w:p>
@@ -6418,14 +6418,14 @@
       </w:pPr>
       <w:r>
         <w:rPr>
-          <w:rFonts w:ascii="STSong" w:hAnsi="STSong" w:eastAsia="STSong" w:cs="STSong" w:hint="eastAsia"/>
+          <w:rFonts w:ascii="FangSong" w:hAnsi="FangSong" w:eastAsia="FangSong" w:cs="FangSong" w:hint="eastAsia"/>
           <w:b w:val="0"/>
           <w:i w:val="0"/>
           <w:color w:val="202020"/>
           <w:sz w:val="21"/>
           <w:lang w:val="zh-CN" w:eastAsia="zh-CN" w:bidi="ar-SA"/>
         </w:rPr>
-        <w:t>增加 Hermes Active、Native Active、Fallback 和 Failed 的时间线事件及 UI 标识。</w:t>
+        <w:t>增加 Hermes Active、历史 Native、Failed 和历史 Fallback 的时间线事件及 UI 标识。</w:t>
       </w:r>
     </w:p>
     <w:p>
@@ -6437,14 +6437,14 @@
       </w:pPr>
       <w:r>
         <w:rPr>
-          <w:rFonts w:ascii="STSong" w:hAnsi="STSong" w:eastAsia="STSong" w:cs="STSong" w:hint="eastAsia"/>
+          <w:rFonts w:ascii="FangSong" w:hAnsi="FangSong" w:eastAsia="FangSong" w:cs="FangSong" w:hint="eastAsia"/>
           <w:b w:val="0"/>
           <w:i w:val="0"/>
           <w:color w:val="202020"/>
           <w:sz w:val="21"/>
           <w:lang w:val="zh-CN" w:eastAsia="zh-CN" w:bidi="ar-SA"/>
         </w:rPr>
-        <w:t>实现 Auto 路由的最小版本，先覆盖多工具任务、网页研究、代码调试和多步 Office。</w:t>
+        <w:t>为内置 Hermes 任务关闭静默 fallback；运行时不可用时明确失败并提示无需单独安装 Hermes Agent。</w:t>
       </w:r>
     </w:p>
     <w:p>
@@ -6456,26 +6456,7 @@
       </w:pPr>
       <w:r>
         <w:rPr>
-          <w:rFonts w:ascii="STSong" w:hAnsi="STSong" w:eastAsia="STSong" w:cs="STSong" w:hint="eastAsia"/>
-          <w:b w:val="0"/>
-          <w:i w:val="0"/>
-          <w:color w:val="202020"/>
-          <w:sz w:val="21"/>
-          <w:lang w:val="zh-CN" w:eastAsia="zh-CN" w:bidi="ar-SA"/>
-        </w:rPr>
-        <w:t>为强制 Hermes 任务关闭静默 fallback；为 Auto 任务记录降级原因。</w:t>
-      </w:r>
-    </w:p>
-    <w:p>
-      <w:pPr>
-        <w:pStyle w:val="ListBullet"/>
-        <w:keepLines/>
-        <w:spacing w:before="0" w:after="60" w:line="276" w:lineRule="auto"/>
-        <w:ind w:left="0" w:firstLine="0"/>
-      </w:pPr>
-      <w:r>
-        <w:rPr>
-          <w:rFonts w:ascii="STSong" w:hAnsi="STSong" w:eastAsia="STSong" w:cs="STSong" w:hint="eastAsia"/>
+          <w:rFonts w:ascii="FangSong" w:hAnsi="FangSong" w:eastAsia="FangSong" w:cs="FangSong" w:hint="eastAsia"/>
           <w:b w:val="0"/>
           <w:i w:val="0"/>
           <w:color w:val="202020"/>
@@ -6494,7 +6475,7 @@
       </w:pPr>
       <w:r>
         <w:rPr>
-          <w:rFonts w:ascii="STSong" w:hAnsi="STSong" w:eastAsia="STSong" w:cs="STSong" w:hint="eastAsia"/>
+          <w:rFonts w:ascii="FangSong" w:hAnsi="FangSong" w:eastAsia="FangSong" w:cs="FangSong" w:hint="eastAsia"/>
           <w:b w:val="0"/>
           <w:i w:val="0"/>
           <w:color w:val="202020"/>
@@ -6512,7 +6493,7 @@
       </w:pPr>
       <w:r>
         <w:rPr>
-          <w:rFonts w:ascii="STSong" w:hAnsi="STSong" w:eastAsia="STSong" w:cs="STSong" w:hint="eastAsia"/>
+          <w:rFonts w:ascii="FangSong" w:hAnsi="FangSong" w:eastAsia="FangSong" w:cs="FangSong" w:hint="eastAsia"/>
           <w:b/>
           <w:i w:val="0"/>
           <w:color w:val="202020"/>
@@ -6523,14 +6504,14 @@
       </w:r>
       <w:r>
         <w:rPr>
-          <w:rFonts w:ascii="STSong" w:hAnsi="STSong" w:eastAsia="STSong" w:cs="STSong" w:hint="eastAsia"/>
+          <w:rFonts w:ascii="FangSong" w:hAnsi="FangSong" w:eastAsia="FangSong" w:cs="FangSong" w:hint="eastAsia"/>
           <w:b w:val="0"/>
           <w:i w:val="0"/>
           <w:color w:val="202020"/>
           <w:sz w:val="21"/>
           <w:lang w:val="zh-CN" w:eastAsia="zh-CN" w:bidi="ar-SA"/>
         </w:rPr>
-        <w:t>用户能够明确知道任务是否真正使用 Hermes，复杂任务能够稳定经过 Hermes Agent Loop，NeoWorker 仍然拥有所有工具副作用，并且任何失败或降级都不会被伪装成成功。</w:t>
+        <w:t>用户能够明确知道任务是否真正使用 Hermes，所有新任务能够稳定经过 Hermes Agent Loop，NeoWorker 仍然拥有所有工具副作用，并且任何失败或历史回退都不会被伪装成成功。</w:t>
       </w:r>
     </w:p>
     <w:p>
@@ -6541,7 +6522,7 @@
       </w:pPr>
       <w:r>
         <w:rPr>
-          <w:rFonts w:ascii="STSong" w:hAnsi="STSong" w:eastAsia="STSong" w:cs="STSong" w:hint="eastAsia"/>
+          <w:rFonts w:ascii="FangSong" w:hAnsi="FangSong" w:eastAsia="FangSong" w:cs="FangSong" w:hint="eastAsia"/>
           <w:b/>
           <w:i w:val="0"/>
           <w:color w:val="202020"/>
@@ -6558,14 +6539,14 @@
       </w:pPr>
       <w:r>
         <w:rPr>
-          <w:rFonts w:ascii="STSong" w:hAnsi="STSong" w:eastAsia="STSong" w:cs="STSong" w:hint="eastAsia"/>
+          <w:rFonts w:ascii="FangSong" w:hAnsi="FangSong" w:eastAsia="FangSong" w:cs="FangSong" w:hint="eastAsia"/>
           <w:b w:val="0"/>
           <w:i w:val="0"/>
           <w:color w:val="202020"/>
           <w:sz w:val="18"/>
           <w:lang w:val="zh-CN" w:eastAsia="zh-CN" w:bidi="ar-SA"/>
         </w:rPr>
-        <w:t>docs/hermes-runtime.md 记录三种 Hermes 接入方式、ACP Tool Host 边界和运行时生命周期。</w:t>
+        <w:t>docs/hermes-runtime.md 记录内置 Hermes ACP Host、Tool Host 边界和运行时生命周期。</w:t>
       </w:r>
     </w:p>
     <w:p>
@@ -6575,7 +6556,7 @@
       </w:pPr>
       <w:r>
         <w:rPr>
-          <w:rFonts w:ascii="STSong" w:hAnsi="STSong" w:eastAsia="STSong" w:cs="STSong" w:hint="eastAsia"/>
+          <w:rFonts w:ascii="FangSong" w:hAnsi="FangSong" w:eastAsia="FangSong" w:cs="FangSong" w:hint="eastAsia"/>
           <w:b w:val="0"/>
           <w:i w:val="0"/>
           <w:color w:val="202020"/>
@@ -6592,7 +6573,7 @@
       </w:pPr>
       <w:r>
         <w:rPr>
-          <w:rFonts w:ascii="STSong" w:hAnsi="STSong" w:eastAsia="STSong" w:cs="STSong" w:hint="eastAsia"/>
+          <w:rFonts w:ascii="FangSong" w:hAnsi="FangSong" w:eastAsia="FangSong" w:cs="FangSong" w:hint="eastAsia"/>
           <w:b w:val="0"/>
           <w:i w:val="0"/>
           <w:color w:val="202020"/>
@@ -6609,14 +6590,14 @@
       </w:pPr>
       <w:r>
         <w:rPr>
-          <w:rFonts w:ascii="STSong" w:hAnsi="STSong" w:eastAsia="STSong" w:cs="STSong" w:hint="eastAsia"/>
+          <w:rFonts w:ascii="FangSong" w:hAnsi="FangSong" w:eastAsia="FangSong" w:cs="FangSong" w:hint="eastAsia"/>
           <w:b w:val="0"/>
           <w:i w:val="0"/>
           <w:color w:val="202020"/>
           <w:sz w:val="18"/>
           <w:lang w:val="zh-CN" w:eastAsia="zh-CN" w:bidi="ar-SA"/>
         </w:rPr>
-        <w:t>src/electron/agent/executor.ts 包含 Hermes external runtime 的选择和执行分支；普通任务仍走 NeoWorker native SessionRuntime。</w:t>
+        <w:t>src/electron/agent/executor.ts 包含内置 Hermes external runtime 的执行分支；Native SessionRuntime 仅保留历史兼容路径。</w:t>
       </w:r>
     </w:p>
     <w:sectPr>
@@ -6642,18 +6623,18 @@
     </w:pPr>
     <w:r>
       <w:rPr>
-        <w:rFonts w:ascii="STSong" w:hAnsi="STSong" w:eastAsia="STSong" w:cs="STSong" w:hint="eastAsia"/>
+        <w:rFonts w:ascii="FangSong" w:hAnsi="FangSong" w:eastAsia="FangSong" w:cs="FangSong" w:hint="eastAsia"/>
         <w:b w:val="0"/>
         <w:i w:val="0"/>
         <w:color w:val="5F6875"/>
         <w:sz w:val="17"/>
         <w:lang w:val="zh-CN" w:eastAsia="zh-CN" w:bidi="ar-SA"/>
       </w:rPr>
-      <w:t xml:space="preserve">开放草案  ·  2026年9月11日  ·  </w:t>
+      <w:t xml:space="preserve">实施收口版  ·  2026年9月11日  ·  </w:t>
     </w:r>
     <w:r>
       <w:rPr>
-        <w:rFonts w:ascii="STSong" w:hAnsi="STSong" w:eastAsia="STSong" w:cs="STSong" w:hint="eastAsia"/>
+        <w:rFonts w:ascii="FangSong" w:hAnsi="FangSong" w:eastAsia="FangSong" w:cs="FangSong" w:hint="eastAsia"/>
         <w:color w:val="5F6875"/>
         <w:sz w:val="18"/>
         <w:lang w:val="zh-CN" w:eastAsia="zh-CN" w:bidi="ar-SA"/>
@@ -6677,7 +6658,7 @@
     </w:pPr>
     <w:r>
       <w:rPr>
-        <w:rFonts w:ascii="STSong" w:hAnsi="STSong" w:eastAsia="STSong" w:cs="STSong" w:hint="eastAsia"/>
+        <w:rFonts w:ascii="FangSong" w:hAnsi="FangSong" w:eastAsia="FangSong" w:cs="FangSong" w:hint="eastAsia"/>
         <w:b w:val="0"/>
         <w:i w:val="0"/>
         <w:color w:val="5F6875"/>
@@ -7054,7 +7035,7 @@
     <w:qFormat/>
     <w:rsid w:val="00FC693F"/>
     <w:rPr>
-      <w:rFonts w:ascii="STSong" w:hAnsi="STSong" w:eastAsia="STSong" w:cs="STSong"/>
+      <w:rFonts w:ascii="FangSong" w:hAnsi="FangSong" w:eastAsia="FangSong" w:cs="FangSong"/>
       <w:color w:val="202020"/>
       <w:sz w:val="21"/>
     </w:rPr>
@@ -7118,7 +7099,7 @@
       <w:outlineLvl w:val="0"/>
     </w:pPr>
     <w:rPr>
-      <w:rFonts w:asciiTheme="majorHAnsi" w:eastAsiaTheme="majorEastAsia" w:hAnsiTheme="majorHAnsi" w:cstheme="majorBidi" w:ascii="STSong" w:hAnsi="STSong" w:eastAsia="STSong" w:cs="STSong"/>
+      <w:rFonts w:asciiTheme="majorHAnsi" w:eastAsiaTheme="majorEastAsia" w:hAnsiTheme="majorHAnsi" w:cstheme="majorBidi" w:ascii="FangSong" w:hAnsi="FangSong" w:eastAsia="FangSong" w:cs="FangSong"/>
       <w:b/>
       <w:bCs/>
       <w:color w:val="202020"/>
@@ -7142,7 +7123,7 @@
       <w:outlineLvl w:val="1"/>
     </w:pPr>
     <w:rPr>
-      <w:rFonts w:asciiTheme="majorHAnsi" w:eastAsiaTheme="majorEastAsia" w:hAnsiTheme="majorHAnsi" w:cstheme="majorBidi" w:ascii="STSong" w:hAnsi="STSong" w:eastAsia="STSong" w:cs="STSong"/>
+      <w:rFonts w:asciiTheme="majorHAnsi" w:eastAsiaTheme="majorEastAsia" w:hAnsiTheme="majorHAnsi" w:cstheme="majorBidi" w:ascii="FangSong" w:hAnsi="FangSong" w:eastAsia="FangSong" w:cs="FangSong"/>
       <w:b/>
       <w:bCs/>
       <w:color w:val="202020"/>
@@ -7166,7 +7147,7 @@
       <w:outlineLvl w:val="2"/>
     </w:pPr>
     <w:rPr>
-      <w:rFonts w:asciiTheme="majorHAnsi" w:eastAsiaTheme="majorEastAsia" w:hAnsiTheme="majorHAnsi" w:cstheme="majorBidi" w:ascii="STSong" w:hAnsi="STSong" w:eastAsia="STSong" w:cs="STSong"/>
+      <w:rFonts w:asciiTheme="majorHAnsi" w:eastAsiaTheme="majorEastAsia" w:hAnsiTheme="majorHAnsi" w:cstheme="majorBidi" w:ascii="FangSong" w:hAnsi="FangSong" w:eastAsia="FangSong" w:cs="FangSong"/>
       <w:b/>
       <w:bCs/>
       <w:color w:val="202020"/>
@@ -7405,7 +7386,7 @@
       <w:contextualSpacing/>
     </w:pPr>
     <w:rPr>
-      <w:rFonts w:asciiTheme="majorHAnsi" w:eastAsiaTheme="majorEastAsia" w:hAnsiTheme="majorHAnsi" w:cstheme="majorBidi" w:ascii="STSong" w:hAnsi="STSong" w:eastAsia="STSong" w:cs="STSong"/>
+      <w:rFonts w:asciiTheme="majorHAnsi" w:eastAsiaTheme="majorEastAsia" w:hAnsiTheme="majorHAnsi" w:cstheme="majorBidi" w:ascii="FangSong" w:hAnsi="FangSong" w:eastAsia="FangSong" w:cs="FangSong"/>
       <w:b/>
       <w:color w:val="202020"/>
       <w:spacing w:val="5"/>
@@ -7587,7 +7568,7 @@
       <w:contextualSpacing/>
     </w:pPr>
     <w:rPr>
-      <w:rFonts w:ascii="STSong" w:hAnsi="STSong" w:eastAsia="STSong" w:cs="STSong"/>
+      <w:rFonts w:ascii="FangSong" w:hAnsi="FangSong" w:eastAsia="FangSong" w:cs="FangSong"/>
       <w:color w:val="202020"/>
       <w:sz w:val="21"/>
     </w:rPr>
@@ -7605,7 +7586,7 @@
       <w:contextualSpacing/>
     </w:pPr>
     <w:rPr>
-      <w:rFonts w:ascii="STSong" w:hAnsi="STSong" w:eastAsia="STSong" w:cs="STSong"/>
+      <w:rFonts w:ascii="FangSong" w:hAnsi="FangSong" w:eastAsia="FangSong" w:cs="FangSong"/>
       <w:color w:val="202020"/>
       <w:sz w:val="21"/>
     </w:rPr>
@@ -7636,7 +7617,7 @@
       <w:contextualSpacing/>
     </w:pPr>
     <w:rPr>
-      <w:rFonts w:ascii="STSong" w:hAnsi="STSong" w:eastAsia="STSong" w:cs="STSong"/>
+      <w:rFonts w:ascii="FangSong" w:hAnsi="FangSong" w:eastAsia="FangSong" w:cs="FangSong"/>
       <w:color w:val="202020"/>
       <w:sz w:val="21"/>
     </w:rPr>

</xml_diff>